<commit_message>
Audit for Phases 1, 2, & 3
</commit_message>
<xml_diff>
--- a/Other Files/Prompt - Phasewise and Taskwise - Algorithmic Trading System.docx
+++ b/Other Files/Prompt - Phasewise and Taskwise - Algorithmic Trading System.docx
@@ -2201,13 +2201,7 @@
         <w:rPr>
           <w:color w:val="FF0000"/>
         </w:rPr>
-        <w:t xml:space="preserve"> </w:t>
-      </w:r>
-      <w:r>
-        <w:rPr>
-          <w:color w:val="FF0000"/>
-        </w:rPr>
-        <w:t>one at a time</w:t>
+        <w:t xml:space="preserve"> one at a time</w:t>
       </w:r>
       <w:r>
         <w:rPr>
@@ -4339,15 +4333,7 @@
           <w:bCs/>
           <w:color w:val="0000FF"/>
         </w:rPr>
-        <w:t>Prompt to Clean Up Global Installations (Optional)</w:t>
-      </w:r>
-      <w:r>
-        <w:rPr>
-          <w:b/>
-          <w:bCs/>
-          <w:color w:val="0000FF"/>
-        </w:rPr>
-        <w:t>:</w:t>
+        <w:t>Prompt to Clean Up Global Installations (Optional):</w:t>
       </w:r>
     </w:p>
     <w:p>
@@ -4453,17 +4439,7 @@
           <w:sz w:val="22"/>
           <w:szCs w:val="22"/>
         </w:rPr>
-        <w:t>or</w:t>
-      </w:r>
-      <w:r>
-        <w:rPr>
-          <w:rStyle w:val="citation-179"/>
-          <w:rFonts w:ascii="Garamond" w:eastAsiaTheme="majorEastAsia" w:hAnsi="Garamond"/>
-          <w:color w:val="0000FF"/>
-          <w:sz w:val="22"/>
-          <w:szCs w:val="22"/>
-        </w:rPr>
-        <w:t xml:space="preserve"> </w:t>
+        <w:t xml:space="preserve">or </w:t>
       </w:r>
       <w:proofErr w:type="spellStart"/>
       <w:r>
@@ -10802,13 +10778,7 @@
         <w:rPr>
           <w:color w:val="0000FF"/>
         </w:rPr>
-        <w:t>.</w:t>
-      </w:r>
-      <w:r>
-        <w:rPr>
-          <w:color w:val="0000FF"/>
-        </w:rPr>
-        <w:t xml:space="preserve">  </w:t>
+        <w:t xml:space="preserve">.  </w:t>
       </w:r>
     </w:p>
     <w:p>
@@ -10836,15 +10806,7 @@
           <w:bCs/>
           <w:color w:val="0000FF"/>
         </w:rPr>
-        <w:t>T</w:t>
-      </w:r>
-      <w:r>
-        <w:rPr>
-          <w:b/>
-          <w:bCs/>
-          <w:color w:val="0000FF"/>
-        </w:rPr>
-        <w:t>radingGym</w:t>
+        <w:t>TradingGym</w:t>
       </w:r>
       <w:proofErr w:type="spellEnd"/>
       <w:r>
@@ -10915,13 +10877,7 @@
         <w:rPr>
           <w:color w:val="0000FF"/>
         </w:rPr>
-        <w:t>. This is the best—and only—tool in your stack for this specific purpose.</w:t>
-      </w:r>
-      <w:r>
-        <w:rPr>
-          <w:color w:val="0000FF"/>
-        </w:rPr>
-        <w:t xml:space="preserve"> </w:t>
+        <w:t xml:space="preserve">. This is the best—and only—tool in your stack for this specific purpose. </w:t>
       </w:r>
     </w:p>
     <w:p>
@@ -14458,6 +14414,2844 @@
       <w:pPr>
         <w:spacing w:line="240" w:lineRule="auto"/>
       </w:pPr>
+    </w:p>
+    <w:p>
+      <w:pPr>
+        <w:spacing w:line="240" w:lineRule="auto"/>
+      </w:pPr>
+    </w:p>
+    <w:p>
+      <w:pPr>
+        <w:spacing w:line="240" w:lineRule="auto"/>
+      </w:pPr>
+    </w:p>
+    <w:p>
+      <w:pPr>
+        <w:spacing w:line="240" w:lineRule="auto"/>
+        <w:rPr>
+          <w:color w:val="FF0000"/>
+        </w:rPr>
+      </w:pPr>
+      <w:r>
+        <w:rPr>
+          <w:color w:val="FF0000"/>
+        </w:rPr>
+        <w:t xml:space="preserve">Phase 3 AI Assistant MVP - Final Validation Report </w:t>
+      </w:r>
+    </w:p>
+    <w:p>
+      <w:pPr>
+        <w:spacing w:line="240" w:lineRule="auto"/>
+        <w:rPr>
+          <w:color w:val="FF0000"/>
+        </w:rPr>
+      </w:pPr>
+      <w:r>
+        <w:rPr>
+          <w:color w:val="FF0000"/>
+        </w:rPr>
+        <w:t xml:space="preserve">Executive Summary </w:t>
+      </w:r>
+    </w:p>
+    <w:p>
+      <w:pPr>
+        <w:spacing w:line="240" w:lineRule="auto"/>
+        <w:rPr>
+          <w:color w:val="FF0000"/>
+        </w:rPr>
+      </w:pPr>
+      <w:r>
+        <w:rPr>
+          <w:color w:val="FF0000"/>
+        </w:rPr>
+        <w:t xml:space="preserve">Status: </w:t>
+      </w:r>
+      <w:r>
+        <w:rPr>
+          <w:rFonts w:ascii="Segoe UI Emoji" w:hAnsi="Segoe UI Emoji" w:cs="Segoe UI Emoji"/>
+          <w:color w:val="FF0000"/>
+        </w:rPr>
+        <w:t>❌</w:t>
+      </w:r>
+      <w:r>
+        <w:rPr>
+          <w:color w:val="FF0000"/>
+        </w:rPr>
+        <w:t xml:space="preserve"> NOT IMPLEMENTED </w:t>
+      </w:r>
+    </w:p>
+    <w:p>
+      <w:pPr>
+        <w:spacing w:line="240" w:lineRule="auto"/>
+        <w:rPr>
+          <w:color w:val="FF0000"/>
+        </w:rPr>
+      </w:pPr>
+      <w:r>
+        <w:rPr>
+          <w:color w:val="FF0000"/>
+        </w:rPr>
+        <w:t xml:space="preserve">The comprehensive audit reveals that Phase 3: AI Assistant MVP is currently a placeholder implementation rather than a completed feature set. While the directory structure exists and some foundational code is present, the core Phase 3 requirements outlined in the integration plan are not implemented. </w:t>
+      </w:r>
+    </w:p>
+    <w:p>
+      <w:pPr>
+        <w:spacing w:line="240" w:lineRule="auto"/>
+        <w:rPr>
+          <w:color w:val="FF0000"/>
+        </w:rPr>
+      </w:pPr>
+    </w:p>
+    <w:p>
+      <w:pPr>
+        <w:spacing w:line="240" w:lineRule="auto"/>
+        <w:rPr>
+          <w:color w:val="FF0000"/>
+        </w:rPr>
+      </w:pPr>
+      <w:r>
+        <w:rPr>
+          <w:color w:val="FF0000"/>
+        </w:rPr>
+        <w:t xml:space="preserve">Detailed Comparison: Planned vs Actual Implementation </w:t>
+      </w:r>
+    </w:p>
+    <w:p>
+      <w:pPr>
+        <w:spacing w:line="240" w:lineRule="auto"/>
+        <w:rPr>
+          <w:color w:val="FF0000"/>
+        </w:rPr>
+      </w:pPr>
+      <w:r>
+        <w:rPr>
+          <w:color w:val="FF0000"/>
+        </w:rPr>
+        <w:t xml:space="preserve">| Feature Category | Planned (Per Documentation) | Actual Implementation | Status | </w:t>
+      </w:r>
+    </w:p>
+    <w:p>
+      <w:pPr>
+        <w:spacing w:line="240" w:lineRule="auto"/>
+        <w:rPr>
+          <w:color w:val="FF0000"/>
+        </w:rPr>
+      </w:pPr>
+      <w:r>
+        <w:rPr>
+          <w:color w:val="FF0000"/>
+        </w:rPr>
+        <w:t xml:space="preserve">|----------------------|----------------------------------|---------------------------|------------| </w:t>
+      </w:r>
+    </w:p>
+    <w:p>
+      <w:pPr>
+        <w:spacing w:line="240" w:lineRule="auto"/>
+        <w:rPr>
+          <w:color w:val="FF0000"/>
+        </w:rPr>
+      </w:pPr>
+      <w:r>
+        <w:rPr>
+          <w:color w:val="FF0000"/>
+        </w:rPr>
+        <w:t xml:space="preserve">| AI Assistant Service | Full microservice with </w:t>
+      </w:r>
+      <w:proofErr w:type="spellStart"/>
+      <w:r>
+        <w:rPr>
+          <w:color w:val="FF0000"/>
+        </w:rPr>
+        <w:t>FastAPI</w:t>
+      </w:r>
+      <w:proofErr w:type="spellEnd"/>
+      <w:r>
+        <w:rPr>
+          <w:color w:val="FF0000"/>
+        </w:rPr>
+        <w:t xml:space="preserve">, PostgreSQL, Docker | Placeholder directory with README stating "NOT IMPLEMENTED YET" | </w:t>
+      </w:r>
+      <w:r>
+        <w:rPr>
+          <w:rFonts w:ascii="Segoe UI Emoji" w:hAnsi="Segoe UI Emoji" w:cs="Segoe UI Emoji"/>
+          <w:color w:val="FF0000"/>
+        </w:rPr>
+        <w:t>❌</w:t>
+      </w:r>
+      <w:r>
+        <w:rPr>
+          <w:color w:val="FF0000"/>
+        </w:rPr>
+        <w:t xml:space="preserve"> Missing | </w:t>
+      </w:r>
+    </w:p>
+    <w:p>
+      <w:pPr>
+        <w:spacing w:line="240" w:lineRule="auto"/>
+        <w:rPr>
+          <w:color w:val="FF0000"/>
+        </w:rPr>
+      </w:pPr>
+      <w:r>
+        <w:rPr>
+          <w:color w:val="FF0000"/>
+        </w:rPr>
+        <w:t xml:space="preserve">| Agentic Tools | 8 specialized tools (Portfolio, Risk, Market, etc.) | No tool implementations found | </w:t>
+      </w:r>
+      <w:r>
+        <w:rPr>
+          <w:rFonts w:ascii="Segoe UI Emoji" w:hAnsi="Segoe UI Emoji" w:cs="Segoe UI Emoji"/>
+          <w:color w:val="FF0000"/>
+        </w:rPr>
+        <w:t>❌</w:t>
+      </w:r>
+      <w:r>
+        <w:rPr>
+          <w:color w:val="FF0000"/>
+        </w:rPr>
+        <w:t xml:space="preserve"> Missing | </w:t>
+      </w:r>
+    </w:p>
+    <w:p>
+      <w:pPr>
+        <w:spacing w:line="240" w:lineRule="auto"/>
+        <w:rPr>
+          <w:color w:val="FF0000"/>
+        </w:rPr>
+      </w:pPr>
+      <w:r>
+        <w:rPr>
+          <w:color w:val="FF0000"/>
+        </w:rPr>
+        <w:t xml:space="preserve">| Core Agent | </w:t>
+      </w:r>
+      <w:proofErr w:type="spellStart"/>
+      <w:r>
+        <w:rPr>
+          <w:color w:val="FF0000"/>
+        </w:rPr>
+        <w:t>LangChain</w:t>
+      </w:r>
+      <w:proofErr w:type="spellEnd"/>
+      <w:r>
+        <w:rPr>
+          <w:color w:val="FF0000"/>
+        </w:rPr>
+        <w:t>/</w:t>
+      </w:r>
+      <w:proofErr w:type="spellStart"/>
+      <w:r>
+        <w:rPr>
+          <w:color w:val="FF0000"/>
+        </w:rPr>
+        <w:t>LangGraph</w:t>
+      </w:r>
+      <w:proofErr w:type="spellEnd"/>
+      <w:r>
+        <w:rPr>
+          <w:color w:val="FF0000"/>
+        </w:rPr>
+        <w:t xml:space="preserve"> orchestration layer | No agent framework detected | </w:t>
+      </w:r>
+      <w:r>
+        <w:rPr>
+          <w:rFonts w:ascii="Segoe UI Emoji" w:hAnsi="Segoe UI Emoji" w:cs="Segoe UI Emoji"/>
+          <w:color w:val="FF0000"/>
+        </w:rPr>
+        <w:t>❌</w:t>
+      </w:r>
+      <w:r>
+        <w:rPr>
+          <w:color w:val="FF0000"/>
+        </w:rPr>
+        <w:t xml:space="preserve"> Missing | </w:t>
+      </w:r>
+    </w:p>
+    <w:p>
+      <w:pPr>
+        <w:spacing w:line="240" w:lineRule="auto"/>
+        <w:rPr>
+          <w:color w:val="FF0000"/>
+        </w:rPr>
+      </w:pPr>
+      <w:r>
+        <w:rPr>
+          <w:color w:val="FF0000"/>
+        </w:rPr>
+        <w:t xml:space="preserve">| Feature Store | Dedicated AI feature store with vector DB | No feature store implementation | </w:t>
+      </w:r>
+      <w:r>
+        <w:rPr>
+          <w:rFonts w:ascii="Segoe UI Emoji" w:hAnsi="Segoe UI Emoji" w:cs="Segoe UI Emoji"/>
+          <w:color w:val="FF0000"/>
+        </w:rPr>
+        <w:t>❌</w:t>
+      </w:r>
+      <w:r>
+        <w:rPr>
+          <w:color w:val="FF0000"/>
+        </w:rPr>
+        <w:t xml:space="preserve"> Missing | </w:t>
+      </w:r>
+    </w:p>
+    <w:p>
+      <w:pPr>
+        <w:spacing w:line="240" w:lineRule="auto"/>
+        <w:rPr>
+          <w:color w:val="FF0000"/>
+        </w:rPr>
+      </w:pPr>
+      <w:r>
+        <w:rPr>
+          <w:color w:val="FF0000"/>
+        </w:rPr>
+        <w:t xml:space="preserve">| Chatbot Interface | Lobe Chat integration with RAG pipeline | No chatbot interface | </w:t>
+      </w:r>
+      <w:r>
+        <w:rPr>
+          <w:rFonts w:ascii="Segoe UI Emoji" w:hAnsi="Segoe UI Emoji" w:cs="Segoe UI Emoji"/>
+          <w:color w:val="FF0000"/>
+        </w:rPr>
+        <w:t>❌</w:t>
+      </w:r>
+      <w:r>
+        <w:rPr>
+          <w:color w:val="FF0000"/>
+        </w:rPr>
+        <w:t xml:space="preserve"> Missing | </w:t>
+      </w:r>
+    </w:p>
+    <w:p>
+      <w:pPr>
+        <w:spacing w:line="240" w:lineRule="auto"/>
+        <w:rPr>
+          <w:color w:val="FF0000"/>
+        </w:rPr>
+      </w:pPr>
+      <w:r>
+        <w:rPr>
+          <w:color w:val="FF0000"/>
+        </w:rPr>
+        <w:t xml:space="preserve">| RAG Pipeline | Retrieval-Augmented Generation system | No RAG implementation | </w:t>
+      </w:r>
+      <w:r>
+        <w:rPr>
+          <w:rFonts w:ascii="Segoe UI Emoji" w:hAnsi="Segoe UI Emoji" w:cs="Segoe UI Emoji"/>
+          <w:color w:val="FF0000"/>
+        </w:rPr>
+        <w:t>❌</w:t>
+      </w:r>
+      <w:r>
+        <w:rPr>
+          <w:color w:val="FF0000"/>
+        </w:rPr>
+        <w:t xml:space="preserve"> Missing | </w:t>
+      </w:r>
+    </w:p>
+    <w:p>
+      <w:pPr>
+        <w:spacing w:line="240" w:lineRule="auto"/>
+        <w:rPr>
+          <w:color w:val="FF0000"/>
+        </w:rPr>
+      </w:pPr>
+      <w:r>
+        <w:rPr>
+          <w:color w:val="FF0000"/>
+        </w:rPr>
+        <w:t xml:space="preserve">| Forecasting Models | Stock prediction models with XAI | Basic forecasting models placeholder | </w:t>
+      </w:r>
+      <w:r>
+        <w:rPr>
+          <w:rFonts w:ascii="Segoe UI Emoji" w:hAnsi="Segoe UI Emoji" w:cs="Segoe UI Emoji"/>
+          <w:color w:val="FF0000"/>
+        </w:rPr>
+        <w:t>⚠️</w:t>
+      </w:r>
+      <w:r>
+        <w:rPr>
+          <w:color w:val="FF0000"/>
+        </w:rPr>
+        <w:t xml:space="preserve"> Partial | </w:t>
+      </w:r>
+    </w:p>
+    <w:p>
+      <w:pPr>
+        <w:spacing w:line="240" w:lineRule="auto"/>
+        <w:rPr>
+          <w:color w:val="FF0000"/>
+        </w:rPr>
+      </w:pPr>
+      <w:r>
+        <w:rPr>
+          <w:color w:val="FF0000"/>
+        </w:rPr>
+        <w:t xml:space="preserve">| NLP Processing | Financial NLP with explainability | NLP modules exist but minimal functionality | </w:t>
+      </w:r>
+      <w:r>
+        <w:rPr>
+          <w:rFonts w:ascii="Segoe UI Emoji" w:hAnsi="Segoe UI Emoji" w:cs="Segoe UI Emoji"/>
+          <w:color w:val="FF0000"/>
+        </w:rPr>
+        <w:t>⚠️</w:t>
+      </w:r>
+      <w:r>
+        <w:rPr>
+          <w:color w:val="FF0000"/>
+        </w:rPr>
+        <w:t xml:space="preserve"> Partial | </w:t>
+      </w:r>
+    </w:p>
+    <w:p>
+      <w:pPr>
+        <w:spacing w:line="240" w:lineRule="auto"/>
+        <w:rPr>
+          <w:color w:val="FF0000"/>
+        </w:rPr>
+      </w:pPr>
+      <w:r>
+        <w:rPr>
+          <w:color w:val="FF0000"/>
+        </w:rPr>
+        <w:t xml:space="preserve">| Security | SAST with Bandit, secure coding | Security measures not implemented | </w:t>
+      </w:r>
+      <w:r>
+        <w:rPr>
+          <w:rFonts w:ascii="Segoe UI Emoji" w:hAnsi="Segoe UI Emoji" w:cs="Segoe UI Emoji"/>
+          <w:color w:val="FF0000"/>
+        </w:rPr>
+        <w:t>❌</w:t>
+      </w:r>
+      <w:r>
+        <w:rPr>
+          <w:color w:val="FF0000"/>
+        </w:rPr>
+        <w:t xml:space="preserve"> Missing | </w:t>
+      </w:r>
+    </w:p>
+    <w:p>
+      <w:pPr>
+        <w:spacing w:line="240" w:lineRule="auto"/>
+        <w:rPr>
+          <w:color w:val="FF0000"/>
+        </w:rPr>
+      </w:pPr>
+      <w:r>
+        <w:rPr>
+          <w:color w:val="FF0000"/>
+        </w:rPr>
+        <w:t xml:space="preserve">| Docker Setup | Containerized microservice | No Docker configuration for Phase 3 | </w:t>
+      </w:r>
+      <w:r>
+        <w:rPr>
+          <w:rFonts w:ascii="Segoe UI Emoji" w:hAnsi="Segoe UI Emoji" w:cs="Segoe UI Emoji"/>
+          <w:color w:val="FF0000"/>
+        </w:rPr>
+        <w:t>❌</w:t>
+      </w:r>
+      <w:r>
+        <w:rPr>
+          <w:color w:val="FF0000"/>
+        </w:rPr>
+        <w:t xml:space="preserve"> Missing | </w:t>
+      </w:r>
+    </w:p>
+    <w:p>
+      <w:pPr>
+        <w:spacing w:line="240" w:lineRule="auto"/>
+        <w:rPr>
+          <w:color w:val="FF0000"/>
+        </w:rPr>
+      </w:pPr>
+      <w:r>
+        <w:rPr>
+          <w:color w:val="FF0000"/>
+        </w:rPr>
+        <w:t xml:space="preserve">Evidence Summary </w:t>
+      </w:r>
+    </w:p>
+    <w:p>
+      <w:pPr>
+        <w:spacing w:line="240" w:lineRule="auto"/>
+        <w:rPr>
+          <w:color w:val="FF0000"/>
+        </w:rPr>
+      </w:pPr>
+      <w:r>
+        <w:rPr>
+          <w:rFonts w:ascii="Segoe UI Emoji" w:hAnsi="Segoe UI Emoji" w:cs="Segoe UI Emoji"/>
+          <w:color w:val="FF0000"/>
+        </w:rPr>
+        <w:t>✅</w:t>
+      </w:r>
+      <w:r>
+        <w:rPr>
+          <w:color w:val="FF0000"/>
+        </w:rPr>
+        <w:t xml:space="preserve"> What Exists (Placeholder Structure) </w:t>
+      </w:r>
+    </w:p>
+    <w:p>
+      <w:pPr>
+        <w:spacing w:line="240" w:lineRule="auto"/>
+        <w:rPr>
+          <w:color w:val="FF0000"/>
+        </w:rPr>
+      </w:pPr>
+      <w:r>
+        <w:rPr>
+          <w:color w:val="FF0000"/>
+        </w:rPr>
+        <w:t>Directory structure: </w:t>
+      </w:r>
+      <w:proofErr w:type="spellStart"/>
+      <w:r>
+        <w:rPr>
+          <w:color w:val="FF0000"/>
+        </w:rPr>
+        <w:t>ai_assistant</w:t>
+      </w:r>
+      <w:proofErr w:type="spellEnd"/>
+      <w:r>
+        <w:rPr>
+          <w:color w:val="FF0000"/>
+        </w:rPr>
+        <w:t xml:space="preserve">/ with subdirectories </w:t>
+      </w:r>
+    </w:p>
+    <w:p>
+      <w:pPr>
+        <w:spacing w:line="240" w:lineRule="auto"/>
+        <w:rPr>
+          <w:color w:val="FF0000"/>
+        </w:rPr>
+      </w:pPr>
+      <w:r>
+        <w:rPr>
+          <w:color w:val="FF0000"/>
+        </w:rPr>
+        <w:t xml:space="preserve">Basic Python files with importable modules </w:t>
+      </w:r>
+    </w:p>
+    <w:p>
+      <w:pPr>
+        <w:spacing w:line="240" w:lineRule="auto"/>
+        <w:rPr>
+          <w:color w:val="FF0000"/>
+        </w:rPr>
+      </w:pPr>
+      <w:r>
+        <w:rPr>
+          <w:color w:val="FF0000"/>
+        </w:rPr>
+        <w:t xml:space="preserve">Requirements.txt with dependencies listed </w:t>
+      </w:r>
+    </w:p>
+    <w:p>
+      <w:pPr>
+        <w:spacing w:line="240" w:lineRule="auto"/>
+        <w:rPr>
+          <w:color w:val="FF0000"/>
+        </w:rPr>
+      </w:pPr>
+      <w:r>
+        <w:rPr>
+          <w:color w:val="FF0000"/>
+        </w:rPr>
+        <w:t xml:space="preserve">README.md acknowledging placeholder status </w:t>
+      </w:r>
+    </w:p>
+    <w:p>
+      <w:pPr>
+        <w:spacing w:line="240" w:lineRule="auto"/>
+        <w:rPr>
+          <w:color w:val="FF0000"/>
+        </w:rPr>
+      </w:pPr>
+      <w:r>
+        <w:rPr>
+          <w:rFonts w:ascii="Segoe UI Emoji" w:hAnsi="Segoe UI Emoji" w:cs="Segoe UI Emoji"/>
+          <w:color w:val="FF0000"/>
+        </w:rPr>
+        <w:t>❌</w:t>
+      </w:r>
+      <w:r>
+        <w:rPr>
+          <w:color w:val="FF0000"/>
+        </w:rPr>
+        <w:t xml:space="preserve"> What's Missing (Core Requirements) </w:t>
+      </w:r>
+    </w:p>
+    <w:p>
+      <w:pPr>
+        <w:spacing w:line="240" w:lineRule="auto"/>
+        <w:rPr>
+          <w:color w:val="FF0000"/>
+        </w:rPr>
+      </w:pPr>
+      <w:r>
+        <w:rPr>
+          <w:color w:val="FF0000"/>
+        </w:rPr>
+        <w:t xml:space="preserve">No </w:t>
+      </w:r>
+      <w:proofErr w:type="spellStart"/>
+      <w:r>
+        <w:rPr>
+          <w:color w:val="FF0000"/>
+        </w:rPr>
+        <w:t>FastAPI</w:t>
+      </w:r>
+      <w:proofErr w:type="spellEnd"/>
+      <w:r>
+        <w:rPr>
+          <w:color w:val="FF0000"/>
+        </w:rPr>
+        <w:t xml:space="preserve"> service implementation </w:t>
+      </w:r>
+    </w:p>
+    <w:p>
+      <w:pPr>
+        <w:spacing w:line="240" w:lineRule="auto"/>
+        <w:rPr>
+          <w:color w:val="FF0000"/>
+        </w:rPr>
+      </w:pPr>
+      <w:r>
+        <w:rPr>
+          <w:color w:val="FF0000"/>
+        </w:rPr>
+        <w:t xml:space="preserve">No PostgreSQL with </w:t>
+      </w:r>
+      <w:proofErr w:type="spellStart"/>
+      <w:r>
+        <w:rPr>
+          <w:color w:val="FF0000"/>
+        </w:rPr>
+        <w:t>pgvector</w:t>
+      </w:r>
+      <w:proofErr w:type="spellEnd"/>
+      <w:r>
+        <w:rPr>
+          <w:color w:val="FF0000"/>
+        </w:rPr>
+        <w:t xml:space="preserve"> integration </w:t>
+      </w:r>
+    </w:p>
+    <w:p>
+      <w:pPr>
+        <w:spacing w:line="240" w:lineRule="auto"/>
+        <w:rPr>
+          <w:color w:val="FF0000"/>
+        </w:rPr>
+      </w:pPr>
+      <w:r>
+        <w:rPr>
+          <w:color w:val="FF0000"/>
+        </w:rPr>
+        <w:t xml:space="preserve">No </w:t>
+      </w:r>
+      <w:proofErr w:type="spellStart"/>
+      <w:r>
+        <w:rPr>
+          <w:color w:val="FF0000"/>
+        </w:rPr>
+        <w:t>LangChain</w:t>
+      </w:r>
+      <w:proofErr w:type="spellEnd"/>
+      <w:r>
+        <w:rPr>
+          <w:color w:val="FF0000"/>
+        </w:rPr>
+        <w:t>/</w:t>
+      </w:r>
+      <w:proofErr w:type="spellStart"/>
+      <w:r>
+        <w:rPr>
+          <w:color w:val="FF0000"/>
+        </w:rPr>
+        <w:t>LangGraph</w:t>
+      </w:r>
+      <w:proofErr w:type="spellEnd"/>
+      <w:r>
+        <w:rPr>
+          <w:color w:val="FF0000"/>
+        </w:rPr>
+        <w:t xml:space="preserve"> agent framework </w:t>
+      </w:r>
+    </w:p>
+    <w:p>
+      <w:pPr>
+        <w:spacing w:line="240" w:lineRule="auto"/>
+        <w:rPr>
+          <w:color w:val="FF0000"/>
+        </w:rPr>
+      </w:pPr>
+      <w:r>
+        <w:rPr>
+          <w:color w:val="FF0000"/>
+        </w:rPr>
+        <w:t xml:space="preserve">No specialized trading tools </w:t>
+      </w:r>
+    </w:p>
+    <w:p>
+      <w:pPr>
+        <w:spacing w:line="240" w:lineRule="auto"/>
+        <w:rPr>
+          <w:color w:val="FF0000"/>
+        </w:rPr>
+      </w:pPr>
+      <w:r>
+        <w:rPr>
+          <w:color w:val="FF0000"/>
+        </w:rPr>
+        <w:t xml:space="preserve">No RAG pipeline or vector database </w:t>
+      </w:r>
+    </w:p>
+    <w:p>
+      <w:pPr>
+        <w:spacing w:line="240" w:lineRule="auto"/>
+        <w:rPr>
+          <w:color w:val="FF0000"/>
+        </w:rPr>
+      </w:pPr>
+      <w:r>
+        <w:rPr>
+          <w:color w:val="FF0000"/>
+        </w:rPr>
+        <w:t xml:space="preserve">No chatbot interface </w:t>
+      </w:r>
+    </w:p>
+    <w:p>
+      <w:pPr>
+        <w:spacing w:line="240" w:lineRule="auto"/>
+        <w:rPr>
+          <w:color w:val="FF0000"/>
+        </w:rPr>
+      </w:pPr>
+      <w:r>
+        <w:rPr>
+          <w:color w:val="FF0000"/>
+        </w:rPr>
+        <w:t xml:space="preserve">No feature store for AI </w:t>
+      </w:r>
+    </w:p>
+    <w:p>
+      <w:pPr>
+        <w:spacing w:line="240" w:lineRule="auto"/>
+        <w:rPr>
+          <w:color w:val="FF0000"/>
+        </w:rPr>
+      </w:pPr>
+      <w:r>
+        <w:rPr>
+          <w:color w:val="FF0000"/>
+        </w:rPr>
+        <w:t xml:space="preserve">No Docker configuration </w:t>
+      </w:r>
+    </w:p>
+    <w:p>
+      <w:pPr>
+        <w:spacing w:line="240" w:lineRule="auto"/>
+        <w:rPr>
+          <w:color w:val="FF0000"/>
+        </w:rPr>
+      </w:pPr>
+      <w:r>
+        <w:rPr>
+          <w:color w:val="FF0000"/>
+        </w:rPr>
+        <w:t xml:space="preserve">No security scanning setup </w:t>
+      </w:r>
+    </w:p>
+    <w:p>
+      <w:pPr>
+        <w:spacing w:line="240" w:lineRule="auto"/>
+        <w:rPr>
+          <w:color w:val="FF0000"/>
+        </w:rPr>
+      </w:pPr>
+      <w:r>
+        <w:rPr>
+          <w:color w:val="FF0000"/>
+        </w:rPr>
+        <w:t xml:space="preserve">Terminal Output Analysis </w:t>
+      </w:r>
+    </w:p>
+    <w:p>
+      <w:pPr>
+        <w:spacing w:line="240" w:lineRule="auto"/>
+        <w:rPr>
+          <w:color w:val="FF0000"/>
+        </w:rPr>
+      </w:pPr>
+      <w:r>
+        <w:rPr>
+          <w:color w:val="FF0000"/>
+        </w:rPr>
+        <w:t xml:space="preserve">The active terminal shows successful imports of NLP modules, but this appears to be testing placeholder/stub implementations rather than functional Phase 3 features. </w:t>
+      </w:r>
+    </w:p>
+    <w:p>
+      <w:pPr>
+        <w:spacing w:line="240" w:lineRule="auto"/>
+        <w:rPr>
+          <w:color w:val="FF0000"/>
+        </w:rPr>
+      </w:pPr>
+    </w:p>
+    <w:p>
+      <w:pPr>
+        <w:spacing w:line="240" w:lineRule="auto"/>
+        <w:rPr>
+          <w:color w:val="FF0000"/>
+        </w:rPr>
+      </w:pPr>
+      <w:r>
+        <w:rPr>
+          <w:color w:val="FF0000"/>
+        </w:rPr>
+        <w:t xml:space="preserve">Conclusion </w:t>
+      </w:r>
+    </w:p>
+    <w:p>
+      <w:pPr>
+        <w:spacing w:line="240" w:lineRule="auto"/>
+        <w:rPr>
+          <w:color w:val="FF0000"/>
+        </w:rPr>
+      </w:pPr>
+      <w:r>
+        <w:rPr>
+          <w:color w:val="FF0000"/>
+        </w:rPr>
+        <w:t xml:space="preserve">Phase 3 AI Assistant MVP is 0% complete against the original integration plan. The current implementation serves only as a structural placeholder. Full development effort is required to meet Phase 3 requirements. </w:t>
+      </w:r>
+    </w:p>
+    <w:p>
+      <w:pPr>
+        <w:spacing w:line="240" w:lineRule="auto"/>
+        <w:rPr>
+          <w:color w:val="FF0000"/>
+        </w:rPr>
+      </w:pPr>
+      <w:r>
+        <w:rPr>
+          <w:color w:val="FF0000"/>
+        </w:rPr>
+        <w:t xml:space="preserve">API Request </w:t>
+      </w:r>
+    </w:p>
+    <w:p>
+      <w:pPr>
+        <w:spacing w:line="240" w:lineRule="auto"/>
+        <w:rPr>
+          <w:color w:val="FF0000"/>
+        </w:rPr>
+      </w:pPr>
+      <w:r>
+        <w:rPr>
+          <w:color w:val="FF0000"/>
+        </w:rPr>
+        <w:t xml:space="preserve">$0.5680 </w:t>
+      </w:r>
+    </w:p>
+    <w:p>
+      <w:pPr>
+        <w:spacing w:line="240" w:lineRule="auto"/>
+        <w:rPr>
+          <w:color w:val="FF0000"/>
+        </w:rPr>
+      </w:pPr>
+      <w:r>
+        <w:rPr>
+          <w:color w:val="FF0000"/>
+        </w:rPr>
+        <w:t xml:space="preserve">I see there's a significant discrepancy between what the Ask mode analysis found and what we've actually completed. Let me perform a thorough investigation to provide an accurate comparison. </w:t>
+      </w:r>
+    </w:p>
+    <w:p>
+      <w:pPr>
+        <w:spacing w:line="240" w:lineRule="auto"/>
+        <w:rPr>
+          <w:color w:val="FF0000"/>
+        </w:rPr>
+      </w:pPr>
+      <w:r>
+        <w:rPr>
+          <w:color w:val="FF0000"/>
+        </w:rPr>
+        <w:t xml:space="preserve">Kilo Code wants to create a new subtask in Code mode: </w:t>
+      </w:r>
+    </w:p>
+    <w:p>
+      <w:pPr>
+        <w:spacing w:line="240" w:lineRule="auto"/>
+        <w:rPr>
+          <w:color w:val="FF0000"/>
+        </w:rPr>
+      </w:pPr>
+      <w:r>
+        <w:rPr>
+          <w:color w:val="FF0000"/>
+        </w:rPr>
+        <w:t xml:space="preserve">Subtask Instructions </w:t>
+      </w:r>
+    </w:p>
+    <w:p>
+      <w:pPr>
+        <w:spacing w:line="240" w:lineRule="auto"/>
+        <w:rPr>
+          <w:color w:val="FF0000"/>
+        </w:rPr>
+      </w:pPr>
+      <w:r>
+        <w:rPr>
+          <w:color w:val="FF0000"/>
+        </w:rPr>
+        <w:t xml:space="preserve">Perform a comprehensive audit of Phase 3 implementation to create a detailed comparison between planned and actual features. </w:t>
+      </w:r>
+    </w:p>
+    <w:p>
+      <w:pPr>
+        <w:spacing w:line="240" w:lineRule="auto"/>
+        <w:rPr>
+          <w:color w:val="FF0000"/>
+        </w:rPr>
+      </w:pPr>
+      <w:r>
+        <w:rPr>
+          <w:color w:val="FF0000"/>
+        </w:rPr>
+        <w:t xml:space="preserve">Context: </w:t>
+      </w:r>
+    </w:p>
+    <w:p>
+      <w:pPr>
+        <w:spacing w:line="240" w:lineRule="auto"/>
+        <w:rPr>
+          <w:color w:val="FF0000"/>
+        </w:rPr>
+      </w:pPr>
+    </w:p>
+    <w:p>
+      <w:pPr>
+        <w:spacing w:line="240" w:lineRule="auto"/>
+        <w:rPr>
+          <w:color w:val="FF0000"/>
+        </w:rPr>
+      </w:pPr>
+      <w:r>
+        <w:rPr>
+          <w:color w:val="FF0000"/>
+        </w:rPr>
+        <w:t xml:space="preserve">We need to verify what was actually implemented in Phase 3 </w:t>
+      </w:r>
+    </w:p>
+    <w:p>
+      <w:pPr>
+        <w:spacing w:line="240" w:lineRule="auto"/>
+        <w:rPr>
+          <w:color w:val="FF0000"/>
+        </w:rPr>
+      </w:pPr>
+      <w:r>
+        <w:rPr>
+          <w:color w:val="FF0000"/>
+        </w:rPr>
+        <w:t xml:space="preserve">The previous analysis suggests Phase 3 might be incomplete, but our task list shows all items as completed </w:t>
+      </w:r>
+    </w:p>
+    <w:p>
+      <w:pPr>
+        <w:spacing w:line="240" w:lineRule="auto"/>
+        <w:rPr>
+          <w:color w:val="FF0000"/>
+        </w:rPr>
+      </w:pPr>
+      <w:r>
+        <w:rPr>
+          <w:color w:val="FF0000"/>
+        </w:rPr>
+        <w:t xml:space="preserve">We need to check actual files and their contents </w:t>
+      </w:r>
+    </w:p>
+    <w:p>
+      <w:pPr>
+        <w:spacing w:line="240" w:lineRule="auto"/>
+        <w:rPr>
+          <w:color w:val="FF0000"/>
+        </w:rPr>
+      </w:pPr>
+      <w:r>
+        <w:rPr>
+          <w:color w:val="FF0000"/>
+        </w:rPr>
+        <w:t xml:space="preserve">Tasks: </w:t>
+      </w:r>
+    </w:p>
+    <w:p>
+      <w:pPr>
+        <w:spacing w:line="240" w:lineRule="auto"/>
+        <w:rPr>
+          <w:color w:val="FF0000"/>
+        </w:rPr>
+      </w:pPr>
+    </w:p>
+    <w:p>
+      <w:pPr>
+        <w:spacing w:line="240" w:lineRule="auto"/>
+        <w:rPr>
+          <w:color w:val="FF0000"/>
+        </w:rPr>
+      </w:pPr>
+      <w:r>
+        <w:rPr>
+          <w:color w:val="FF0000"/>
+        </w:rPr>
+        <w:t xml:space="preserve">First, use </w:t>
+      </w:r>
+      <w:proofErr w:type="spellStart"/>
+      <w:r>
+        <w:rPr>
+          <w:color w:val="FF0000"/>
+        </w:rPr>
+        <w:t>codebase_search</w:t>
+      </w:r>
+      <w:proofErr w:type="spellEnd"/>
+      <w:r>
+        <w:rPr>
+          <w:color w:val="FF0000"/>
+        </w:rPr>
+        <w:t xml:space="preserve"> to find all Phase 3 related implementations: </w:t>
+      </w:r>
+    </w:p>
+    <w:p>
+      <w:pPr>
+        <w:spacing w:line="240" w:lineRule="auto"/>
+        <w:rPr>
+          <w:color w:val="FF0000"/>
+        </w:rPr>
+      </w:pPr>
+      <w:r>
+        <w:rPr>
+          <w:color w:val="FF0000"/>
+        </w:rPr>
+        <w:t xml:space="preserve">Search for "AI Assistant" implementations </w:t>
+      </w:r>
+    </w:p>
+    <w:p>
+      <w:pPr>
+        <w:spacing w:line="240" w:lineRule="auto"/>
+        <w:rPr>
+          <w:color w:val="FF0000"/>
+        </w:rPr>
+      </w:pPr>
+      <w:r>
+        <w:rPr>
+          <w:color w:val="FF0000"/>
+        </w:rPr>
+        <w:t>Search for "</w:t>
+      </w:r>
+      <w:proofErr w:type="spellStart"/>
+      <w:r>
+        <w:rPr>
+          <w:color w:val="FF0000"/>
+        </w:rPr>
+        <w:t>ReAct</w:t>
+      </w:r>
+      <w:proofErr w:type="spellEnd"/>
+      <w:r>
+        <w:rPr>
+          <w:color w:val="FF0000"/>
+        </w:rPr>
+        <w:t xml:space="preserve"> agent" or "</w:t>
+      </w:r>
+      <w:proofErr w:type="spellStart"/>
+      <w:r>
+        <w:rPr>
+          <w:color w:val="FF0000"/>
+        </w:rPr>
+        <w:t>LangChain</w:t>
+      </w:r>
+      <w:proofErr w:type="spellEnd"/>
+      <w:r>
+        <w:rPr>
+          <w:color w:val="FF0000"/>
+        </w:rPr>
+        <w:t xml:space="preserve">" implementations </w:t>
+      </w:r>
+    </w:p>
+    <w:p>
+      <w:pPr>
+        <w:spacing w:line="240" w:lineRule="auto"/>
+        <w:rPr>
+          <w:color w:val="FF0000"/>
+        </w:rPr>
+      </w:pPr>
+      <w:r>
+        <w:rPr>
+          <w:color w:val="FF0000"/>
+        </w:rPr>
+        <w:t xml:space="preserve">Search for "Lobe Chat" integration </w:t>
+      </w:r>
+    </w:p>
+    <w:p>
+      <w:pPr>
+        <w:spacing w:line="240" w:lineRule="auto"/>
+        <w:rPr>
+          <w:color w:val="FF0000"/>
+        </w:rPr>
+      </w:pPr>
+      <w:r>
+        <w:rPr>
+          <w:color w:val="FF0000"/>
+        </w:rPr>
+        <w:t>Search for "RAG pipeline" or "</w:t>
+      </w:r>
+      <w:proofErr w:type="spellStart"/>
+      <w:r>
+        <w:rPr>
+          <w:color w:val="FF0000"/>
+        </w:rPr>
+        <w:t>Qdrant</w:t>
+      </w:r>
+      <w:proofErr w:type="spellEnd"/>
+      <w:r>
+        <w:rPr>
+          <w:color w:val="FF0000"/>
+        </w:rPr>
+        <w:t xml:space="preserve">" </w:t>
+      </w:r>
+    </w:p>
+    <w:p>
+      <w:pPr>
+        <w:spacing w:line="240" w:lineRule="auto"/>
+        <w:rPr>
+          <w:color w:val="FF0000"/>
+        </w:rPr>
+      </w:pPr>
+      <w:r>
+        <w:rPr>
+          <w:color w:val="FF0000"/>
+        </w:rPr>
+        <w:t xml:space="preserve">Search for "forecasting" or "LSTM" </w:t>
+      </w:r>
+    </w:p>
+    <w:p>
+      <w:pPr>
+        <w:spacing w:line="240" w:lineRule="auto"/>
+        <w:rPr>
+          <w:color w:val="FF0000"/>
+        </w:rPr>
+      </w:pPr>
+      <w:r>
+        <w:rPr>
+          <w:color w:val="FF0000"/>
+        </w:rPr>
+        <w:t xml:space="preserve">Search for "NLP" or "SHAP" implementations </w:t>
+      </w:r>
+    </w:p>
+    <w:p>
+      <w:pPr>
+        <w:spacing w:line="240" w:lineRule="auto"/>
+        <w:rPr>
+          <w:color w:val="FF0000"/>
+        </w:rPr>
+      </w:pPr>
+      <w:r>
+        <w:rPr>
+          <w:color w:val="FF0000"/>
+        </w:rPr>
+        <w:t xml:space="preserve">Read key Phase 3 files to verify their actual implementation status: </w:t>
+      </w:r>
+    </w:p>
+    <w:p>
+      <w:pPr>
+        <w:spacing w:line="240" w:lineRule="auto"/>
+        <w:rPr>
+          <w:color w:val="FF0000"/>
+        </w:rPr>
+      </w:pPr>
+      <w:r>
+        <w:rPr>
+          <w:color w:val="FF0000"/>
+        </w:rPr>
+        <w:t xml:space="preserve">/ai_assistant/main.py (if exists) </w:t>
+      </w:r>
+    </w:p>
+    <w:p>
+      <w:pPr>
+        <w:spacing w:line="240" w:lineRule="auto"/>
+        <w:rPr>
+          <w:color w:val="FF0000"/>
+        </w:rPr>
+      </w:pPr>
+      <w:r>
+        <w:rPr>
+          <w:color w:val="FF0000"/>
+        </w:rPr>
+        <w:t xml:space="preserve">/ai_assistant/tools.py (if exists) </w:t>
+      </w:r>
+    </w:p>
+    <w:p>
+      <w:pPr>
+        <w:spacing w:line="240" w:lineRule="auto"/>
+        <w:rPr>
+          <w:color w:val="FF0000"/>
+        </w:rPr>
+      </w:pPr>
+      <w:r>
+        <w:rPr>
+          <w:color w:val="FF0000"/>
+        </w:rPr>
+        <w:t>/</w:t>
+      </w:r>
+      <w:proofErr w:type="spellStart"/>
+      <w:r>
+        <w:rPr>
+          <w:color w:val="FF0000"/>
+        </w:rPr>
+        <w:t>ai_assistant</w:t>
+      </w:r>
+      <w:proofErr w:type="spellEnd"/>
+      <w:r>
+        <w:rPr>
+          <w:color w:val="FF0000"/>
+        </w:rPr>
+        <w:t>/</w:t>
+      </w:r>
+      <w:proofErr w:type="spellStart"/>
+      <w:r>
+        <w:rPr>
+          <w:color w:val="FF0000"/>
+        </w:rPr>
+        <w:t>Dockerfile</w:t>
+      </w:r>
+      <w:proofErr w:type="spellEnd"/>
+      <w:r>
+        <w:rPr>
+          <w:color w:val="FF0000"/>
+        </w:rPr>
+        <w:t xml:space="preserve"> (if exists) </w:t>
+      </w:r>
+    </w:p>
+    <w:p>
+      <w:pPr>
+        <w:spacing w:line="240" w:lineRule="auto"/>
+        <w:rPr>
+          <w:color w:val="FF0000"/>
+        </w:rPr>
+      </w:pPr>
+      <w:r>
+        <w:rPr>
+          <w:color w:val="FF0000"/>
+        </w:rPr>
+        <w:t xml:space="preserve">/ai_assistant/lobe_chat_adapter.py (if exists) </w:t>
+      </w:r>
+    </w:p>
+    <w:p>
+      <w:pPr>
+        <w:spacing w:line="240" w:lineRule="auto"/>
+        <w:rPr>
+          <w:color w:val="FF0000"/>
+        </w:rPr>
+      </w:pPr>
+      <w:r>
+        <w:rPr>
+          <w:color w:val="FF0000"/>
+        </w:rPr>
+        <w:t xml:space="preserve">/ai_assistant/rag_pipeline.py (if exists) </w:t>
+      </w:r>
+    </w:p>
+    <w:p>
+      <w:pPr>
+        <w:spacing w:line="240" w:lineRule="auto"/>
+        <w:rPr>
+          <w:color w:val="FF0000"/>
+        </w:rPr>
+      </w:pPr>
+      <w:r>
+        <w:rPr>
+          <w:color w:val="FF0000"/>
+        </w:rPr>
+        <w:t xml:space="preserve">/ai_assistant/forecasting_models.py (if exists) </w:t>
+      </w:r>
+    </w:p>
+    <w:p>
+      <w:pPr>
+        <w:spacing w:line="240" w:lineRule="auto"/>
+        <w:rPr>
+          <w:color w:val="FF0000"/>
+        </w:rPr>
+      </w:pPr>
+      <w:r>
+        <w:rPr>
+          <w:color w:val="FF0000"/>
+        </w:rPr>
+        <w:t xml:space="preserve">/ai_assistant/nlp_processor.py </w:t>
+      </w:r>
+    </w:p>
+    <w:p>
+      <w:pPr>
+        <w:spacing w:line="240" w:lineRule="auto"/>
+        <w:rPr>
+          <w:color w:val="FF0000"/>
+        </w:rPr>
+      </w:pPr>
+      <w:r>
+        <w:rPr>
+          <w:color w:val="FF0000"/>
+        </w:rPr>
+        <w:t xml:space="preserve">/ai_assistant/explainability_service.py </w:t>
+      </w:r>
+    </w:p>
+    <w:p>
+      <w:pPr>
+        <w:spacing w:line="240" w:lineRule="auto"/>
+        <w:rPr>
+          <w:color w:val="FF0000"/>
+        </w:rPr>
+      </w:pPr>
+      <w:r>
+        <w:rPr>
+          <w:color w:val="FF0000"/>
+        </w:rPr>
+        <w:t>Check docker-</w:t>
+      </w:r>
+      <w:proofErr w:type="spellStart"/>
+      <w:r>
+        <w:rPr>
+          <w:color w:val="FF0000"/>
+        </w:rPr>
+        <w:t>compose.yml</w:t>
+      </w:r>
+      <w:proofErr w:type="spellEnd"/>
+      <w:r>
+        <w:rPr>
+          <w:color w:val="FF0000"/>
+        </w:rPr>
+        <w:t xml:space="preserve"> for Phase 3 services: </w:t>
+      </w:r>
+    </w:p>
+    <w:p>
+      <w:pPr>
+        <w:spacing w:line="240" w:lineRule="auto"/>
+        <w:rPr>
+          <w:color w:val="FF0000"/>
+        </w:rPr>
+      </w:pPr>
+      <w:r>
+        <w:rPr>
+          <w:color w:val="FF0000"/>
+        </w:rPr>
+        <w:t xml:space="preserve">Look for </w:t>
+      </w:r>
+      <w:proofErr w:type="spellStart"/>
+      <w:r>
+        <w:rPr>
+          <w:color w:val="FF0000"/>
+        </w:rPr>
+        <w:t>ai_assistant</w:t>
+      </w:r>
+      <w:proofErr w:type="spellEnd"/>
+      <w:r>
+        <w:rPr>
+          <w:color w:val="FF0000"/>
+        </w:rPr>
+        <w:t xml:space="preserve"> service </w:t>
+      </w:r>
+    </w:p>
+    <w:p>
+      <w:pPr>
+        <w:spacing w:line="240" w:lineRule="auto"/>
+        <w:rPr>
+          <w:color w:val="FF0000"/>
+        </w:rPr>
+      </w:pPr>
+      <w:r>
+        <w:rPr>
+          <w:color w:val="FF0000"/>
+        </w:rPr>
+        <w:t xml:space="preserve">Look for </w:t>
+      </w:r>
+      <w:proofErr w:type="spellStart"/>
+      <w:r>
+        <w:rPr>
+          <w:color w:val="FF0000"/>
+        </w:rPr>
+        <w:t>lobe_chat</w:t>
+      </w:r>
+      <w:proofErr w:type="spellEnd"/>
+      <w:r>
+        <w:rPr>
+          <w:color w:val="FF0000"/>
+        </w:rPr>
+        <w:t xml:space="preserve"> service </w:t>
+      </w:r>
+    </w:p>
+    <w:p>
+      <w:pPr>
+        <w:spacing w:line="240" w:lineRule="auto"/>
+        <w:rPr>
+          <w:color w:val="FF0000"/>
+        </w:rPr>
+      </w:pPr>
+      <w:r>
+        <w:rPr>
+          <w:color w:val="FF0000"/>
+        </w:rPr>
+        <w:t xml:space="preserve">Look for </w:t>
+      </w:r>
+      <w:proofErr w:type="spellStart"/>
+      <w:r>
+        <w:rPr>
+          <w:color w:val="FF0000"/>
+        </w:rPr>
+        <w:t>qdrant</w:t>
+      </w:r>
+      <w:proofErr w:type="spellEnd"/>
+      <w:r>
+        <w:rPr>
+          <w:color w:val="FF0000"/>
+        </w:rPr>
+        <w:t xml:space="preserve"> service </w:t>
+      </w:r>
+    </w:p>
+    <w:p>
+      <w:pPr>
+        <w:spacing w:line="240" w:lineRule="auto"/>
+        <w:rPr>
+          <w:color w:val="FF0000"/>
+        </w:rPr>
+      </w:pPr>
+      <w:r>
+        <w:rPr>
+          <w:color w:val="FF0000"/>
+        </w:rPr>
+        <w:t>Look for feast/</w:t>
+      </w:r>
+      <w:proofErr w:type="spellStart"/>
+      <w:r>
+        <w:rPr>
+          <w:color w:val="FF0000"/>
+        </w:rPr>
+        <w:t>redis</w:t>
+      </w:r>
+      <w:proofErr w:type="spellEnd"/>
+      <w:r>
+        <w:rPr>
+          <w:color w:val="FF0000"/>
+        </w:rPr>
+        <w:t xml:space="preserve"> services for AI </w:t>
+      </w:r>
+    </w:p>
+    <w:p>
+      <w:pPr>
+        <w:spacing w:line="240" w:lineRule="auto"/>
+        <w:rPr>
+          <w:color w:val="FF0000"/>
+        </w:rPr>
+      </w:pPr>
+      <w:r>
+        <w:rPr>
+          <w:color w:val="FF0000"/>
+        </w:rPr>
+        <w:t xml:space="preserve">Create a comprehensive comparison table showing: </w:t>
+      </w:r>
+    </w:p>
+    <w:p>
+      <w:pPr>
+        <w:spacing w:line="240" w:lineRule="auto"/>
+        <w:rPr>
+          <w:color w:val="FF0000"/>
+        </w:rPr>
+      </w:pPr>
+      <w:r>
+        <w:rPr>
+          <w:color w:val="FF0000"/>
+        </w:rPr>
+        <w:t xml:space="preserve">Original Phase 3 planned features </w:t>
+      </w:r>
+    </w:p>
+    <w:p>
+      <w:pPr>
+        <w:spacing w:line="240" w:lineRule="auto"/>
+        <w:rPr>
+          <w:color w:val="FF0000"/>
+        </w:rPr>
+      </w:pPr>
+      <w:r>
+        <w:rPr>
+          <w:color w:val="FF0000"/>
+        </w:rPr>
+        <w:t xml:space="preserve">Actual implementation status with evidence </w:t>
+      </w:r>
+    </w:p>
+    <w:p>
+      <w:pPr>
+        <w:spacing w:line="240" w:lineRule="auto"/>
+        <w:rPr>
+          <w:color w:val="FF0000"/>
+        </w:rPr>
+      </w:pPr>
+      <w:r>
+        <w:rPr>
+          <w:color w:val="FF0000"/>
+        </w:rPr>
+        <w:t xml:space="preserve">Key files and their actual content </w:t>
+      </w:r>
+    </w:p>
+    <w:p>
+      <w:pPr>
+        <w:spacing w:line="240" w:lineRule="auto"/>
+        <w:rPr>
+          <w:color w:val="FF0000"/>
+        </w:rPr>
+      </w:pPr>
+      <w:r>
+        <w:rPr>
+          <w:color w:val="FF0000"/>
+        </w:rPr>
+        <w:t xml:space="preserve">Documentation created </w:t>
+      </w:r>
+    </w:p>
+    <w:p>
+      <w:pPr>
+        <w:spacing w:line="240" w:lineRule="auto"/>
+        <w:rPr>
+          <w:color w:val="FF0000"/>
+        </w:rPr>
+      </w:pPr>
+      <w:r>
+        <w:rPr>
+          <w:color w:val="FF0000"/>
+        </w:rPr>
+        <w:t xml:space="preserve">Provide documentation snippets showing: </w:t>
+      </w:r>
+    </w:p>
+    <w:p>
+      <w:pPr>
+        <w:spacing w:line="240" w:lineRule="auto"/>
+        <w:rPr>
+          <w:color w:val="FF0000"/>
+        </w:rPr>
+      </w:pPr>
+      <w:r>
+        <w:rPr>
+          <w:color w:val="FF0000"/>
+        </w:rPr>
+        <w:t xml:space="preserve">Natural language command support (if implemented) </w:t>
+      </w:r>
+    </w:p>
+    <w:p>
+      <w:pPr>
+        <w:spacing w:line="240" w:lineRule="auto"/>
+        <w:rPr>
+          <w:color w:val="FF0000"/>
+        </w:rPr>
+      </w:pPr>
+      <w:r>
+        <w:rPr>
+          <w:color w:val="FF0000"/>
+        </w:rPr>
+        <w:t xml:space="preserve">Security features (if implemented) </w:t>
+      </w:r>
+    </w:p>
+    <w:p>
+      <w:pPr>
+        <w:spacing w:line="240" w:lineRule="auto"/>
+        <w:rPr>
+          <w:color w:val="FF0000"/>
+        </w:rPr>
+      </w:pPr>
+      <w:r>
+        <w:rPr>
+          <w:color w:val="FF0000"/>
+        </w:rPr>
+        <w:t xml:space="preserve">Efficiency optimizations (if implemented) </w:t>
+      </w:r>
+    </w:p>
+    <w:p>
+      <w:pPr>
+        <w:spacing w:line="240" w:lineRule="auto"/>
+        <w:rPr>
+          <w:color w:val="FF0000"/>
+        </w:rPr>
+      </w:pPr>
+      <w:r>
+        <w:rPr>
+          <w:color w:val="FF0000"/>
+        </w:rPr>
+        <w:t xml:space="preserve">Only investigate and report findings. Do not make any changes. Signal completion with </w:t>
+      </w:r>
+      <w:proofErr w:type="spellStart"/>
+      <w:r>
+        <w:rPr>
+          <w:color w:val="FF0000"/>
+        </w:rPr>
+        <w:t>attempt_completion</w:t>
+      </w:r>
+      <w:proofErr w:type="spellEnd"/>
+      <w:r>
+        <w:rPr>
+          <w:color w:val="FF0000"/>
+        </w:rPr>
+        <w:t xml:space="preserve">, providing a detailed comparison report that clarifies the actual state of Phase 3 implementation. </w:t>
+      </w:r>
+    </w:p>
+    <w:p>
+      <w:pPr>
+        <w:spacing w:line="240" w:lineRule="auto"/>
+        <w:rPr>
+          <w:color w:val="FF0000"/>
+        </w:rPr>
+      </w:pPr>
+      <w:r>
+        <w:rPr>
+          <w:color w:val="FF0000"/>
+        </w:rPr>
+        <w:t xml:space="preserve">These instructions supersede any conflicting general instructions. </w:t>
+      </w:r>
+    </w:p>
+    <w:p>
+      <w:pPr>
+        <w:pBdr>
+          <w:bottom w:val="single" w:sz="6" w:space="1" w:color="auto"/>
+        </w:pBdr>
+        <w:spacing w:line="240" w:lineRule="auto"/>
+      </w:pPr>
+    </w:p>
+    <w:p>
+      <w:pPr>
+        <w:spacing w:line="240" w:lineRule="auto"/>
+      </w:pPr>
+    </w:p>
+    <w:p>
+      <w:pPr>
+        <w:spacing w:line="240" w:lineRule="auto"/>
+      </w:pPr>
+    </w:p>
+    <w:p>
+      <w:pPr>
+        <w:spacing w:line="240" w:lineRule="auto"/>
+        <w:rPr>
+          <w:b/>
+          <w:bCs/>
+        </w:rPr>
+      </w:pPr>
+      <w:r>
+        <w:rPr>
+          <w:b/>
+          <w:bCs/>
+        </w:rPr>
+        <w:t>## Prompt for Kilo Code: Comprehensive Audit</w:t>
+      </w:r>
+    </w:p>
+    <w:p>
+      <w:pPr>
+        <w:spacing w:line="240" w:lineRule="auto"/>
+      </w:pPr>
+      <w:r>
+        <w:t xml:space="preserve">You are an expert code auditor. Your task is to perform a comprehensive audit of our entire repository to verify the completion status of </w:t>
+      </w:r>
+      <w:r>
+        <w:rPr>
+          <w:b/>
+          <w:bCs/>
+        </w:rPr>
+        <w:t>Phases 1, 2, and 3</w:t>
+      </w:r>
+      <w:r>
+        <w:t>.</w:t>
+      </w:r>
+    </w:p>
+    <w:p>
+      <w:pPr>
+        <w:spacing w:line="240" w:lineRule="auto"/>
+      </w:pPr>
+    </w:p>
+    <w:p>
+      <w:pPr>
+        <w:spacing w:line="240" w:lineRule="auto"/>
+      </w:pPr>
+      <w:r>
+        <w:t xml:space="preserve">The single source of truth for all requirements is the document located at: </w:t>
+      </w:r>
+      <w:r>
+        <w:rPr>
+          <w:b/>
+          <w:bCs/>
+        </w:rPr>
+        <w:t>/docs/01. Features, Phases &amp; Integration Strategy - Algorithmic Trading System.docx</w:t>
+      </w:r>
+      <w:r>
+        <w:t>. You must read and understand the "Integration Plan &amp; Actions" for each phase in this document before you begin.</w:t>
+      </w:r>
+    </w:p>
+    <w:p>
+      <w:pPr>
+        <w:spacing w:line="240" w:lineRule="auto"/>
+      </w:pPr>
+    </w:p>
+    <w:p>
+      <w:pPr>
+        <w:spacing w:line="240" w:lineRule="auto"/>
+      </w:pPr>
+      <w:r>
+        <w:t>Your audit must be thorough and evidence-based. For each phase, perform the following checks:</w:t>
+      </w:r>
+    </w:p>
+    <w:p>
+      <w:pPr>
+        <w:spacing w:line="240" w:lineRule="auto"/>
+      </w:pPr>
+      <w:r>
+        <w:rPr>
+          <w:b/>
+          <w:bCs/>
+        </w:rPr>
+        <w:t>## For Phase 1: Foundational Setup</w:t>
+      </w:r>
+    </w:p>
+    <w:p>
+      <w:pPr>
+        <w:numPr>
+          <w:ilvl w:val="0"/>
+          <w:numId w:val="30"/>
+        </w:numPr>
+        <w:spacing w:line="240" w:lineRule="auto"/>
+      </w:pPr>
+      <w:r>
+        <w:rPr>
+          <w:b/>
+          <w:bCs/>
+        </w:rPr>
+        <w:t>Verify Docker Configuration:</w:t>
+      </w:r>
+      <w:r>
+        <w:t xml:space="preserve"> Read the main docker-</w:t>
+      </w:r>
+      <w:proofErr w:type="spellStart"/>
+      <w:r>
+        <w:t>compose.yml</w:t>
+      </w:r>
+      <w:proofErr w:type="spellEnd"/>
+      <w:r>
+        <w:t xml:space="preserve"> file. Confirm that it contains services for </w:t>
+      </w:r>
+      <w:proofErr w:type="spellStart"/>
+      <w:r>
+        <w:t>NautilusTrader_engine</w:t>
+      </w:r>
+      <w:proofErr w:type="spellEnd"/>
+      <w:r>
+        <w:t xml:space="preserve">, Kafka, Schema Registry, PostgreSQL, </w:t>
+      </w:r>
+      <w:proofErr w:type="spellStart"/>
+      <w:r>
+        <w:t>ClickHouse</w:t>
+      </w:r>
+      <w:proofErr w:type="spellEnd"/>
+      <w:r>
+        <w:t xml:space="preserve">, and </w:t>
+      </w:r>
+      <w:proofErr w:type="spellStart"/>
+      <w:r>
+        <w:t>DuckDB</w:t>
+      </w:r>
+      <w:proofErr w:type="spellEnd"/>
+      <w:r>
+        <w:t xml:space="preserve"> as specified in the plan.</w:t>
+      </w:r>
+    </w:p>
+    <w:p>
+      <w:pPr>
+        <w:numPr>
+          <w:ilvl w:val="0"/>
+          <w:numId w:val="30"/>
+        </w:numPr>
+        <w:spacing w:line="240" w:lineRule="auto"/>
+      </w:pPr>
+      <w:r>
+        <w:rPr>
+          <w:b/>
+          <w:bCs/>
+        </w:rPr>
+        <w:t xml:space="preserve">Check </w:t>
+      </w:r>
+      <w:proofErr w:type="spellStart"/>
+      <w:r>
+        <w:rPr>
+          <w:b/>
+          <w:bCs/>
+        </w:rPr>
+        <w:t>Backtesting</w:t>
+      </w:r>
+      <w:proofErr w:type="spellEnd"/>
+      <w:r>
+        <w:rPr>
+          <w:b/>
+          <w:bCs/>
+        </w:rPr>
+        <w:t xml:space="preserve"> Scripts:</w:t>
+      </w:r>
+      <w:r>
+        <w:t xml:space="preserve"> Read the contents of </w:t>
+      </w:r>
+      <w:r>
+        <w:t>/</w:t>
+      </w:r>
+      <w:r>
+        <w:t xml:space="preserve">nautilus_trader_engine/run_initial_backtest.py (or similar file). Verify that it contains a functional </w:t>
+      </w:r>
+      <w:proofErr w:type="spellStart"/>
+      <w:r>
+        <w:t>backtest</w:t>
+      </w:r>
+      <w:proofErr w:type="spellEnd"/>
+      <w:r>
+        <w:t xml:space="preserve"> using the </w:t>
+      </w:r>
+      <w:proofErr w:type="spellStart"/>
+      <w:r>
+        <w:t>backtrader</w:t>
+      </w:r>
+      <w:proofErr w:type="spellEnd"/>
+      <w:r>
+        <w:t xml:space="preserve"> library as planned.</w:t>
+      </w:r>
+    </w:p>
+    <w:p>
+      <w:pPr>
+        <w:numPr>
+          <w:ilvl w:val="0"/>
+          <w:numId w:val="30"/>
+        </w:numPr>
+        <w:spacing w:line="240" w:lineRule="auto"/>
+      </w:pPr>
+      <w:r>
+        <w:rPr>
+          <w:b/>
+          <w:bCs/>
+        </w:rPr>
+        <w:t>Verify Security Integration:</w:t>
+      </w:r>
+      <w:r>
+        <w:t xml:space="preserve"> Check for a .pre-commit-</w:t>
+      </w:r>
+      <w:proofErr w:type="spellStart"/>
+      <w:r>
+        <w:t>config.yaml</w:t>
+      </w:r>
+      <w:proofErr w:type="spellEnd"/>
+      <w:r>
+        <w:t xml:space="preserve"> file or similar CI/CD configuration. Confirm that it includes a step to run the Bandit SAST tool.</w:t>
+      </w:r>
+    </w:p>
+    <w:p>
+      <w:pPr>
+        <w:numPr>
+          <w:ilvl w:val="0"/>
+          <w:numId w:val="30"/>
+        </w:numPr>
+        <w:spacing w:line="240" w:lineRule="auto"/>
+      </w:pPr>
+      <w:r>
+        <w:rPr>
+          <w:b/>
+          <w:bCs/>
+        </w:rPr>
+        <w:t>Confirm Observability Setup:</w:t>
+      </w:r>
+      <w:r>
+        <w:t xml:space="preserve"> Look at the </w:t>
+      </w:r>
+      <w:proofErr w:type="spellStart"/>
+      <w:r>
+        <w:t>prometheus.yml</w:t>
+      </w:r>
+      <w:proofErr w:type="spellEnd"/>
+      <w:r>
+        <w:t xml:space="preserve"> configuration. Does it have scrape configs? Is there a Grafana service defined in docker-</w:t>
+      </w:r>
+      <w:proofErr w:type="spellStart"/>
+      <w:r>
+        <w:t>compose.yml</w:t>
+      </w:r>
+      <w:proofErr w:type="spellEnd"/>
+      <w:r>
+        <w:t xml:space="preserve">? </w:t>
+      </w:r>
+    </w:p>
+    <w:p>
+      <w:pPr>
+        <w:numPr>
+          <w:ilvl w:val="0"/>
+          <w:numId w:val="30"/>
+        </w:numPr>
+        <w:spacing w:line="240" w:lineRule="auto"/>
+      </w:pPr>
+      <w:r>
+        <w:t>Check for any placeholders or empty files.</w:t>
+      </w:r>
+    </w:p>
+    <w:p>
+      <w:pPr>
+        <w:spacing w:line="240" w:lineRule="auto"/>
+      </w:pPr>
+    </w:p>
+    <w:p>
+      <w:pPr>
+        <w:spacing w:line="240" w:lineRule="auto"/>
+      </w:pPr>
+      <w:r>
+        <w:rPr>
+          <w:b/>
+          <w:bCs/>
+        </w:rPr>
+        <w:t>## For Phase 2: API Bridge &amp; Initial Analytics</w:t>
+      </w:r>
+    </w:p>
+    <w:p>
+      <w:pPr>
+        <w:numPr>
+          <w:ilvl w:val="0"/>
+          <w:numId w:val="31"/>
+        </w:numPr>
+        <w:spacing w:line="240" w:lineRule="auto"/>
+      </w:pPr>
+      <w:r>
+        <w:rPr>
+          <w:b/>
+          <w:bCs/>
+        </w:rPr>
+        <w:t xml:space="preserve">Audit </w:t>
+      </w:r>
+      <w:proofErr w:type="spellStart"/>
+      <w:r>
+        <w:rPr>
+          <w:b/>
+          <w:bCs/>
+        </w:rPr>
+        <w:t>FastAPI</w:t>
+      </w:r>
+      <w:proofErr w:type="spellEnd"/>
+      <w:r>
+        <w:rPr>
+          <w:b/>
+          <w:bCs/>
+        </w:rPr>
+        <w:t xml:space="preserve"> Endpoints:</w:t>
+      </w:r>
+      <w:r>
+        <w:t xml:space="preserve"> Read the </w:t>
+      </w:r>
+      <w:proofErr w:type="spellStart"/>
+      <w:r>
+        <w:t>FastAPI</w:t>
+      </w:r>
+      <w:proofErr w:type="spellEnd"/>
+      <w:r>
+        <w:t xml:space="preserve"> application code, likely in /</w:t>
+      </w:r>
+      <w:proofErr w:type="spellStart"/>
+      <w:r>
+        <w:t>nautilus_trader_engine</w:t>
+      </w:r>
+      <w:proofErr w:type="spellEnd"/>
+      <w:r>
+        <w:t>/</w:t>
+      </w:r>
+      <w:proofErr w:type="spellStart"/>
+      <w:r>
+        <w:t>api</w:t>
+      </w:r>
+      <w:proofErr w:type="spellEnd"/>
+      <w:r>
+        <w:t xml:space="preserve">/main.py. Confirm the existence and function signatures for these specific endpoints: </w:t>
+      </w:r>
+    </w:p>
+    <w:p>
+      <w:pPr>
+        <w:spacing w:line="240" w:lineRule="auto"/>
+        <w:ind w:left="720"/>
+      </w:pPr>
+      <w:r>
+        <w:t>POST /</w:t>
+      </w:r>
+      <w:proofErr w:type="spellStart"/>
+      <w:r>
+        <w:t>backtest</w:t>
+      </w:r>
+      <w:proofErr w:type="spellEnd"/>
+      <w:r>
+        <w:t xml:space="preserve"> , </w:t>
+      </w:r>
+    </w:p>
+    <w:p>
+      <w:pPr>
+        <w:spacing w:line="240" w:lineRule="auto"/>
+        <w:ind w:left="720"/>
+      </w:pPr>
+      <w:r>
+        <w:t xml:space="preserve">POST /optimize , and </w:t>
+      </w:r>
+    </w:p>
+    <w:p>
+      <w:pPr>
+        <w:spacing w:line="240" w:lineRule="auto"/>
+        <w:ind w:left="720"/>
+      </w:pPr>
+      <w:r>
+        <w:t>GET /features/{symbol}.</w:t>
+      </w:r>
+    </w:p>
+    <w:p>
+      <w:pPr>
+        <w:numPr>
+          <w:ilvl w:val="0"/>
+          <w:numId w:val="31"/>
+        </w:numPr>
+        <w:spacing w:line="240" w:lineRule="auto"/>
+      </w:pPr>
+      <w:r>
+        <w:rPr>
+          <w:b/>
+          <w:bCs/>
+        </w:rPr>
+        <w:t xml:space="preserve">Verify GPU </w:t>
+      </w:r>
+      <w:proofErr w:type="spellStart"/>
+      <w:r>
+        <w:rPr>
+          <w:b/>
+          <w:bCs/>
+        </w:rPr>
+        <w:t>Backtesting</w:t>
+      </w:r>
+      <w:proofErr w:type="spellEnd"/>
+      <w:r>
+        <w:rPr>
+          <w:b/>
+          <w:bCs/>
+        </w:rPr>
+        <w:t xml:space="preserve"> Integration:</w:t>
+      </w:r>
+      <w:r>
+        <w:t xml:space="preserve"> Check the </w:t>
+      </w:r>
+      <w:proofErr w:type="spellStart"/>
+      <w:r>
+        <w:t>Dockerfile</w:t>
+      </w:r>
+      <w:proofErr w:type="spellEnd"/>
+      <w:r>
+        <w:t xml:space="preserve"> and requirements.txt for the </w:t>
+      </w:r>
+      <w:proofErr w:type="spellStart"/>
+      <w:r>
+        <w:t>nautilus_trader_engine</w:t>
+      </w:r>
+      <w:proofErr w:type="spellEnd"/>
+      <w:r>
+        <w:t xml:space="preserve"> service. Confirm that </w:t>
+      </w:r>
+      <w:proofErr w:type="spellStart"/>
+      <w:r>
+        <w:t>VectorBT</w:t>
+      </w:r>
+      <w:proofErr w:type="spellEnd"/>
+      <w:r>
+        <w:t xml:space="preserve"> is listed as a dependency.</w:t>
+      </w:r>
+    </w:p>
+    <w:p>
+      <w:pPr>
+        <w:numPr>
+          <w:ilvl w:val="0"/>
+          <w:numId w:val="31"/>
+        </w:numPr>
+        <w:spacing w:line="240" w:lineRule="auto"/>
+      </w:pPr>
+      <w:r>
+        <w:rPr>
+          <w:b/>
+          <w:bCs/>
+        </w:rPr>
+        <w:t xml:space="preserve">Confirm </w:t>
+      </w:r>
+      <w:proofErr w:type="spellStart"/>
+      <w:r>
+        <w:rPr>
+          <w:b/>
+          <w:bCs/>
+        </w:rPr>
+        <w:t>Optuna</w:t>
+      </w:r>
+      <w:proofErr w:type="spellEnd"/>
+      <w:r>
+        <w:rPr>
+          <w:b/>
+          <w:bCs/>
+        </w:rPr>
+        <w:t xml:space="preserve"> Integration:</w:t>
+      </w:r>
+      <w:r>
+        <w:t xml:space="preserve"> Read the code for the POST /optimize endpoint. Verify that it actually imports and uses the </w:t>
+      </w:r>
+      <w:proofErr w:type="spellStart"/>
+      <w:r>
+        <w:t>Optuna</w:t>
+      </w:r>
+      <w:proofErr w:type="spellEnd"/>
+      <w:r>
+        <w:t xml:space="preserve"> library to run a study.</w:t>
+      </w:r>
+    </w:p>
+    <w:p>
+      <w:pPr>
+        <w:numPr>
+          <w:ilvl w:val="0"/>
+          <w:numId w:val="31"/>
+        </w:numPr>
+        <w:spacing w:line="240" w:lineRule="auto"/>
+      </w:pPr>
+      <w:r>
+        <w:rPr>
+          <w:b/>
+          <w:bCs/>
+        </w:rPr>
+        <w:t xml:space="preserve">Check for </w:t>
+      </w:r>
+      <w:proofErr w:type="spellStart"/>
+      <w:r>
+        <w:rPr>
+          <w:b/>
+          <w:bCs/>
+        </w:rPr>
+        <w:t>gRPC</w:t>
+      </w:r>
+      <w:proofErr w:type="spellEnd"/>
+      <w:r>
+        <w:rPr>
+          <w:b/>
+          <w:bCs/>
+        </w:rPr>
+        <w:t xml:space="preserve"> Service:</w:t>
+      </w:r>
+      <w:r>
+        <w:t xml:space="preserve"> Look for a .proto file defining the market data service and a Python script that implements the </w:t>
+      </w:r>
+      <w:proofErr w:type="spellStart"/>
+      <w:r>
+        <w:t>gRPC</w:t>
+      </w:r>
+      <w:proofErr w:type="spellEnd"/>
+      <w:r>
+        <w:t xml:space="preserve"> server logic as planned.</w:t>
+      </w:r>
+    </w:p>
+    <w:p>
+      <w:pPr>
+        <w:numPr>
+          <w:ilvl w:val="0"/>
+          <w:numId w:val="31"/>
+        </w:numPr>
+        <w:spacing w:line="240" w:lineRule="auto"/>
+      </w:pPr>
+      <w:r>
+        <w:t>Check for any placeholders or empty files.</w:t>
+      </w:r>
+    </w:p>
+    <w:p>
+      <w:pPr>
+        <w:spacing w:line="240" w:lineRule="auto"/>
+      </w:pPr>
+    </w:p>
+    <w:p>
+      <w:pPr>
+        <w:spacing w:line="240" w:lineRule="auto"/>
+      </w:pPr>
+      <w:r>
+        <w:rPr>
+          <w:b/>
+          <w:bCs/>
+        </w:rPr>
+        <w:t>## For Phase 3: AI Assistant MVP</w:t>
+      </w:r>
+    </w:p>
+    <w:p>
+      <w:pPr>
+        <w:numPr>
+          <w:ilvl w:val="0"/>
+          <w:numId w:val="32"/>
+        </w:numPr>
+        <w:spacing w:line="240" w:lineRule="auto"/>
+      </w:pPr>
+      <w:r>
+        <w:rPr>
+          <w:b/>
+          <w:bCs/>
+        </w:rPr>
+        <w:t>Verify Core AI Service:</w:t>
+      </w:r>
+      <w:r>
+        <w:t xml:space="preserve"> Check if the /</w:t>
+      </w:r>
+      <w:proofErr w:type="spellStart"/>
+      <w:r>
+        <w:t>ai_assistant</w:t>
+      </w:r>
+      <w:proofErr w:type="spellEnd"/>
+      <w:r>
+        <w:t xml:space="preserve"> directory contains a runnable </w:t>
+      </w:r>
+      <w:proofErr w:type="spellStart"/>
+      <w:r>
+        <w:t>FastAPI</w:t>
+      </w:r>
+      <w:proofErr w:type="spellEnd"/>
+      <w:r>
+        <w:t xml:space="preserve"> service in main.py. Is there a </w:t>
+      </w:r>
+      <w:proofErr w:type="spellStart"/>
+      <w:r>
+        <w:t>Dockerfile</w:t>
+      </w:r>
+      <w:proofErr w:type="spellEnd"/>
+      <w:r>
+        <w:t xml:space="preserve"> in this directory that containerizes the service? </w:t>
+      </w:r>
+    </w:p>
+    <w:p>
+      <w:pPr>
+        <w:numPr>
+          <w:ilvl w:val="0"/>
+          <w:numId w:val="32"/>
+        </w:numPr>
+        <w:spacing w:line="240" w:lineRule="auto"/>
+      </w:pPr>
+      <w:r>
+        <w:rPr>
+          <w:b/>
+          <w:bCs/>
+        </w:rPr>
+        <w:t>Audit Agentic Tools:</w:t>
+      </w:r>
+      <w:r>
+        <w:t xml:space="preserve"> Read the contents of /</w:t>
+      </w:r>
+      <w:proofErr w:type="spellStart"/>
+      <w:r>
+        <w:t>ai_assistant</w:t>
+      </w:r>
+      <w:proofErr w:type="spellEnd"/>
+      <w:r>
+        <w:t xml:space="preserve">/tools.py. List all the </w:t>
+      </w:r>
+      <w:proofErr w:type="spellStart"/>
+      <w:r>
+        <w:t>LangChain</w:t>
+      </w:r>
+      <w:proofErr w:type="spellEnd"/>
+      <w:r>
+        <w:t xml:space="preserve"> tools that have been fully implemented. Compare this against the plan, which includes </w:t>
+      </w:r>
+      <w:proofErr w:type="spellStart"/>
+      <w:r>
+        <w:t>run_backtest_tool</w:t>
+      </w:r>
+      <w:proofErr w:type="spellEnd"/>
+      <w:r>
+        <w:t xml:space="preserve"> and </w:t>
+      </w:r>
+      <w:proofErr w:type="spellStart"/>
+      <w:r>
+        <w:t>query_documents_tool</w:t>
+      </w:r>
+      <w:proofErr w:type="spellEnd"/>
+      <w:r>
+        <w:t xml:space="preserve"> .</w:t>
+      </w:r>
+    </w:p>
+    <w:p>
+      <w:pPr>
+        <w:numPr>
+          <w:ilvl w:val="0"/>
+          <w:numId w:val="32"/>
+        </w:numPr>
+        <w:spacing w:line="240" w:lineRule="auto"/>
+      </w:pPr>
+      <w:r>
+        <w:rPr>
+          <w:b/>
+          <w:bCs/>
+        </w:rPr>
+        <w:t>Check for Agent Framework:</w:t>
+      </w:r>
+      <w:r>
+        <w:t xml:space="preserve"> Read /</w:t>
+      </w:r>
+      <w:proofErr w:type="spellStart"/>
+      <w:r>
+        <w:t>ai_assistant</w:t>
+      </w:r>
+      <w:proofErr w:type="spellEnd"/>
+      <w:r>
+        <w:t xml:space="preserve">/main.py. Is there an actual agent being created using </w:t>
+      </w:r>
+      <w:proofErr w:type="spellStart"/>
+      <w:r>
+        <w:t>LangChain</w:t>
+      </w:r>
+      <w:proofErr w:type="spellEnd"/>
+      <w:r>
+        <w:t xml:space="preserve"> or </w:t>
+      </w:r>
+      <w:proofErr w:type="spellStart"/>
+      <w:r>
+        <w:t>LangGraph</w:t>
+      </w:r>
+      <w:proofErr w:type="spellEnd"/>
+      <w:r>
+        <w:t xml:space="preserve">? Does it load the tools from tools.py? </w:t>
+      </w:r>
+    </w:p>
+    <w:p>
+      <w:pPr>
+        <w:numPr>
+          <w:ilvl w:val="0"/>
+          <w:numId w:val="32"/>
+        </w:numPr>
+        <w:spacing w:line="240" w:lineRule="auto"/>
+      </w:pPr>
+      <w:r>
+        <w:rPr>
+          <w:b/>
+          <w:bCs/>
+        </w:rPr>
+        <w:t>Verify RAG Pipeline:</w:t>
+      </w:r>
+      <w:r>
+        <w:t xml:space="preserve"> Look for code that implements the RAG pipeline. Is there an integration with </w:t>
+      </w:r>
+      <w:proofErr w:type="spellStart"/>
+      <w:r>
+        <w:t>RAGFlow</w:t>
+      </w:r>
+      <w:proofErr w:type="spellEnd"/>
+      <w:r>
+        <w:t xml:space="preserve"> or a vector database like </w:t>
+      </w:r>
+      <w:proofErr w:type="spellStart"/>
+      <w:r>
+        <w:t>Qdrant</w:t>
+      </w:r>
+      <w:proofErr w:type="spellEnd"/>
+      <w:r>
+        <w:t xml:space="preserve">? Is there code for processing documents? </w:t>
+      </w:r>
+    </w:p>
+    <w:p>
+      <w:pPr>
+        <w:numPr>
+          <w:ilvl w:val="0"/>
+          <w:numId w:val="32"/>
+        </w:numPr>
+        <w:spacing w:line="240" w:lineRule="auto"/>
+      </w:pPr>
+      <w:r>
+        <w:rPr>
+          <w:b/>
+          <w:bCs/>
+        </w:rPr>
+        <w:t>Confirm Chatbot and Feature Store:</w:t>
+      </w:r>
+      <w:r>
+        <w:t xml:space="preserve"> Check the main docker-</w:t>
+      </w:r>
+      <w:proofErr w:type="spellStart"/>
+      <w:r>
+        <w:t>compose.yml</w:t>
+      </w:r>
+      <w:proofErr w:type="spellEnd"/>
+      <w:r>
+        <w:t xml:space="preserve">. Is there a service defined for Lobe Chat? Is there a service for a feature store like Feast or </w:t>
+      </w:r>
+      <w:proofErr w:type="spellStart"/>
+      <w:r>
+        <w:t>Tecton</w:t>
+      </w:r>
+      <w:proofErr w:type="spellEnd"/>
+      <w:r>
+        <w:t xml:space="preserve">? </w:t>
+      </w:r>
+    </w:p>
+    <w:p>
+      <w:pPr>
+        <w:numPr>
+          <w:ilvl w:val="0"/>
+          <w:numId w:val="32"/>
+        </w:numPr>
+        <w:spacing w:line="240" w:lineRule="auto"/>
+      </w:pPr>
+      <w:r>
+        <w:t>Check for any placeholders or empty files.</w:t>
+      </w:r>
+    </w:p>
+    <w:p>
+      <w:pPr>
+        <w:spacing w:line="240" w:lineRule="auto"/>
+      </w:pPr>
+    </w:p>
+    <w:p>
+      <w:pPr>
+        <w:spacing w:line="240" w:lineRule="auto"/>
+      </w:pPr>
+      <w:r>
+        <w:rPr>
+          <w:b/>
+          <w:bCs/>
+        </w:rPr>
+        <w:t>## Final Report</w:t>
+      </w:r>
+      <w:r>
+        <w:t xml:space="preserve"> After your audit, generate a comprehensive validation report in a Markdown table. For each of the three phases, list the key planned features and provide:</w:t>
+      </w:r>
+    </w:p>
+    <w:p>
+      <w:pPr>
+        <w:numPr>
+          <w:ilvl w:val="0"/>
+          <w:numId w:val="33"/>
+        </w:numPr>
+        <w:spacing w:line="240" w:lineRule="auto"/>
+      </w:pPr>
+      <w:r>
+        <w:rPr>
+          <w:b/>
+          <w:bCs/>
+        </w:rPr>
+        <w:t>Planned Requirement:</w:t>
+      </w:r>
+      <w:r>
+        <w:t xml:space="preserve"> (e.g., "Implement POST /</w:t>
+      </w:r>
+      <w:proofErr w:type="spellStart"/>
+      <w:r>
+        <w:t>backtest</w:t>
+      </w:r>
+      <w:proofErr w:type="spellEnd"/>
+      <w:r>
+        <w:t xml:space="preserve"> endpoint")</w:t>
+      </w:r>
+    </w:p>
+    <w:p>
+      <w:pPr>
+        <w:numPr>
+          <w:ilvl w:val="0"/>
+          <w:numId w:val="33"/>
+        </w:numPr>
+        <w:spacing w:line="240" w:lineRule="auto"/>
+      </w:pPr>
+      <w:r>
+        <w:rPr>
+          <w:b/>
+          <w:bCs/>
+        </w:rPr>
+        <w:t>Actual Status:</w:t>
+      </w:r>
+      <w:r>
+        <w:t xml:space="preserve"> (</w:t>
+      </w:r>
+      <w:r>
+        <w:rPr>
+          <w:rFonts w:ascii="Segoe UI Emoji" w:hAnsi="Segoe UI Emoji" w:cs="Segoe UI Emoji"/>
+        </w:rPr>
+        <w:t>✅</w:t>
+      </w:r>
+      <w:r>
+        <w:t xml:space="preserve"> Complete, </w:t>
+      </w:r>
+      <w:r>
+        <w:rPr>
+          <w:rFonts w:ascii="Segoe UI Emoji" w:hAnsi="Segoe UI Emoji" w:cs="Segoe UI Emoji"/>
+        </w:rPr>
+        <w:t>⚠️</w:t>
+      </w:r>
+      <w:r>
+        <w:t xml:space="preserve"> Partial, or </w:t>
+      </w:r>
+      <w:r>
+        <w:rPr>
+          <w:rFonts w:ascii="Segoe UI Emoji" w:hAnsi="Segoe UI Emoji" w:cs="Segoe UI Emoji"/>
+        </w:rPr>
+        <w:t>❌</w:t>
+      </w:r>
+      <w:r>
+        <w:t xml:space="preserve"> Missing)</w:t>
+      </w:r>
+    </w:p>
+    <w:p>
+      <w:pPr>
+        <w:numPr>
+          <w:ilvl w:val="0"/>
+          <w:numId w:val="33"/>
+        </w:numPr>
+        <w:spacing w:line="240" w:lineRule="auto"/>
+      </w:pPr>
+      <w:r>
+        <w:rPr>
+          <w:b/>
+          <w:bCs/>
+        </w:rPr>
+        <w:t>Evidence &amp; File Path:</w:t>
+      </w:r>
+      <w:r>
+        <w:t xml:space="preserve"> (e.g., "</w:t>
+      </w:r>
+      <w:r>
+        <w:rPr>
+          <w:rFonts w:ascii="Segoe UI Emoji" w:hAnsi="Segoe UI Emoji" w:cs="Segoe UI Emoji"/>
+        </w:rPr>
+        <w:t>✅</w:t>
+      </w:r>
+      <w:r>
+        <w:t xml:space="preserve"> Complete - Function defined in /</w:t>
+      </w:r>
+      <w:proofErr w:type="spellStart"/>
+      <w:r>
+        <w:t>nautilus_trader_engine</w:t>
+      </w:r>
+      <w:proofErr w:type="spellEnd"/>
+      <w:r>
+        <w:t>/</w:t>
+      </w:r>
+      <w:proofErr w:type="spellStart"/>
+      <w:r>
+        <w:t>api</w:t>
+      </w:r>
+      <w:proofErr w:type="spellEnd"/>
+      <w:r>
+        <w:t>/main.py")</w:t>
+      </w:r>
+    </w:p>
+    <w:p>
+      <w:pPr>
+        <w:numPr>
+          <w:ilvl w:val="0"/>
+          <w:numId w:val="33"/>
+        </w:numPr>
+        <w:spacing w:line="240" w:lineRule="auto"/>
+      </w:pPr>
+      <w:r>
+        <w:t xml:space="preserve">Also, </w:t>
+      </w:r>
+      <w:r>
+        <w:t>list the filenames, locations, and the phase it belongs to, of all the placeholders and empty files.</w:t>
+      </w:r>
+    </w:p>
+    <w:p>
+      <w:pPr>
+        <w:spacing w:line="240" w:lineRule="auto"/>
+      </w:pPr>
+    </w:p>
+    <w:p>
+      <w:pPr>
+        <w:spacing w:line="240" w:lineRule="auto"/>
+      </w:pPr>
+      <w:r>
+        <w:t>Your final output should be a single, clear report that gives us an honest assessment of the project's true completion status up to Phase 3</w:t>
+      </w:r>
+      <w:r>
+        <w:t>, i.e. for Phase 1, 2 and 3</w:t>
+      </w:r>
+      <w:r>
+        <w:t>.</w:t>
+      </w:r>
+    </w:p>
+    <w:p>
+      <w:pPr>
+        <w:spacing w:line="240" w:lineRule="auto"/>
+      </w:pPr>
+    </w:p>
+    <w:p>
+      <w:pPr>
+        <w:spacing w:line="240" w:lineRule="auto"/>
+      </w:pPr>
+    </w:p>
+    <w:p>
+      <w:pPr>
+        <w:spacing w:line="240" w:lineRule="auto"/>
+      </w:pPr>
+      <w:r>
+        <w:t>I have successfully completed the comprehensive audit of the algorithmic trading system repository for Phases 1, 2, and 3. The audit process involved:</w:t>
+      </w:r>
+    </w:p>
+    <w:p>
+      <w:pPr>
+        <w:spacing w:line="240" w:lineRule="auto"/>
+      </w:pPr>
+    </w:p>
+    <w:p>
+      <w:pPr>
+        <w:spacing w:line="240" w:lineRule="auto"/>
+      </w:pPr>
+      <w:r>
+        <w:t>## Workflow Summary</w:t>
+      </w:r>
+    </w:p>
+    <w:p>
+      <w:pPr>
+        <w:spacing w:line="240" w:lineRule="auto"/>
+      </w:pPr>
+    </w:p>
+    <w:p>
+      <w:pPr>
+        <w:spacing w:line="240" w:lineRule="auto"/>
+      </w:pPr>
+      <w:r>
+        <w:t>1. **Document Extraction** - Extracted the "Integration Plan &amp; Actions" sections from the source document to establish the requirements baseline.</w:t>
+      </w:r>
+    </w:p>
+    <w:p>
+      <w:pPr>
+        <w:spacing w:line="240" w:lineRule="auto"/>
+      </w:pPr>
+    </w:p>
+    <w:p>
+      <w:pPr>
+        <w:spacing w:line="240" w:lineRule="auto"/>
+      </w:pPr>
+      <w:r>
+        <w:t>2. **Phase-by-Phase Audit** - Conducted detailed audits for each phase:</w:t>
+      </w:r>
+    </w:p>
+    <w:p>
+      <w:pPr>
+        <w:spacing w:line="240" w:lineRule="auto"/>
+      </w:pPr>
+      <w:r>
+        <w:t xml:space="preserve">   - **Phase 1: Foundational Setup** - 9 of 10 requirements complete (90%), with UI/Analytics partially implemented</w:t>
+      </w:r>
+    </w:p>
+    <w:p>
+      <w:pPr>
+        <w:spacing w:line="240" w:lineRule="auto"/>
+      </w:pPr>
+      <w:r>
+        <w:t xml:space="preserve">   - **Phase 2: API Bridge &amp; Initial Analytics** - 6 of 11 requirements complete (55%), with 3 partial implementations</w:t>
+      </w:r>
+    </w:p>
+    <w:p>
+      <w:pPr>
+        <w:spacing w:line="240" w:lineRule="auto"/>
+      </w:pPr>
+      <w:r>
+        <w:t xml:space="preserve">   - **Phase 3: AI Assistant MVP** - 7 of 8 requirements complete (88%), with only MCP implementation partial</w:t>
+      </w:r>
+    </w:p>
+    <w:p>
+      <w:pPr>
+        <w:spacing w:line="240" w:lineRule="auto"/>
+      </w:pPr>
+    </w:p>
+    <w:p>
+      <w:pPr>
+        <w:spacing w:line="240" w:lineRule="auto"/>
+      </w:pPr>
+      <w:r>
+        <w:t>3. **Repository-Wide Analysis** - Identified all placeholders, TODOs, and empty files across the entire codebase.</w:t>
+      </w:r>
+    </w:p>
+    <w:p>
+      <w:pPr>
+        <w:spacing w:line="240" w:lineRule="auto"/>
+      </w:pPr>
+    </w:p>
+    <w:p>
+      <w:pPr>
+        <w:spacing w:line="240" w:lineRule="auto"/>
+      </w:pPr>
+      <w:r>
+        <w:t>4. **Final Report Generation** - Created a comprehensive validation report saved as [`PHASE_1_2_3_AUDIT_REPORT.md`](PHASE_1_2_3_AUDIT_REPORT.md).</w:t>
+      </w:r>
+    </w:p>
+    <w:p>
+      <w:pPr>
+        <w:spacing w:line="240" w:lineRule="auto"/>
+      </w:pPr>
+    </w:p>
+    <w:p>
+      <w:pPr>
+        <w:spacing w:line="240" w:lineRule="auto"/>
+      </w:pPr>
+      <w:r>
+        <w:t>## Key Findings</w:t>
+      </w:r>
+    </w:p>
+    <w:p>
+      <w:pPr>
+        <w:spacing w:line="240" w:lineRule="auto"/>
+      </w:pPr>
+    </w:p>
+    <w:p>
+      <w:pPr>
+        <w:spacing w:line="240" w:lineRule="auto"/>
+      </w:pPr>
+      <w:r>
+        <w:t>The project demonstrates strong progress with most core infrastructure and functionality in place:</w:t>
+      </w:r>
+    </w:p>
+    <w:p>
+      <w:pPr>
+        <w:spacing w:line="240" w:lineRule="auto"/>
+      </w:pPr>
+      <w:r>
+        <w:t xml:space="preserve">- </w:t>
+      </w:r>
+      <w:r>
+        <w:rPr>
+          <w:rFonts w:ascii="Segoe UI Emoji" w:hAnsi="Segoe UI Emoji" w:cs="Segoe UI Emoji"/>
+        </w:rPr>
+        <w:t>✅</w:t>
+      </w:r>
+      <w:r>
+        <w:t xml:space="preserve"> Docker containerization fully implemented</w:t>
+      </w:r>
+    </w:p>
+    <w:p>
+      <w:pPr>
+        <w:spacing w:line="240" w:lineRule="auto"/>
+      </w:pPr>
+      <w:r>
+        <w:t xml:space="preserve">- </w:t>
+      </w:r>
+      <w:r>
+        <w:rPr>
+          <w:rFonts w:ascii="Segoe UI Emoji" w:hAnsi="Segoe UI Emoji" w:cs="Segoe UI Emoji"/>
+        </w:rPr>
+        <w:t>✅</w:t>
+      </w:r>
+      <w:r>
+        <w:t xml:space="preserve"> Trading engine and </w:t>
+      </w:r>
+      <w:proofErr w:type="spellStart"/>
+      <w:r>
+        <w:t>backtesting</w:t>
+      </w:r>
+      <w:proofErr w:type="spellEnd"/>
+      <w:r>
+        <w:t xml:space="preserve"> tools operational</w:t>
+      </w:r>
+    </w:p>
+    <w:p>
+      <w:pPr>
+        <w:spacing w:line="240" w:lineRule="auto"/>
+      </w:pPr>
+      <w:r>
+        <w:t xml:space="preserve">- </w:t>
+      </w:r>
+      <w:r>
+        <w:rPr>
+          <w:rFonts w:ascii="Segoe UI Emoji" w:hAnsi="Segoe UI Emoji" w:cs="Segoe UI Emoji"/>
+        </w:rPr>
+        <w:t>✅</w:t>
+      </w:r>
+      <w:r>
+        <w:t xml:space="preserve"> API endpoints and authentication complete</w:t>
+      </w:r>
+    </w:p>
+    <w:p>
+      <w:pPr>
+        <w:spacing w:line="240" w:lineRule="auto"/>
+      </w:pPr>
+      <w:r>
+        <w:t xml:space="preserve">- </w:t>
+      </w:r>
+      <w:r>
+        <w:rPr>
+          <w:rFonts w:ascii="Segoe UI Emoji" w:hAnsi="Segoe UI Emoji" w:cs="Segoe UI Emoji"/>
+        </w:rPr>
+        <w:t>✅</w:t>
+      </w:r>
+      <w:r>
+        <w:t xml:space="preserve"> AI assistant with RAG pipeline functional</w:t>
+      </w:r>
+    </w:p>
+    <w:p>
+      <w:pPr>
+        <w:spacing w:line="240" w:lineRule="auto"/>
+      </w:pPr>
+      <w:r>
+        <w:t xml:space="preserve">- </w:t>
+      </w:r>
+      <w:r>
+        <w:rPr>
+          <w:rFonts w:ascii="Segoe UI Emoji" w:hAnsi="Segoe UI Emoji" w:cs="Segoe UI Emoji"/>
+        </w:rPr>
+        <w:t>⚠️</w:t>
+      </w:r>
+      <w:r>
+        <w:t xml:space="preserve"> Some features have placeholder implementations</w:t>
+      </w:r>
+    </w:p>
+    <w:p>
+      <w:pPr>
+        <w:spacing w:line="240" w:lineRule="auto"/>
+      </w:pPr>
+      <w:r>
+        <w:t xml:space="preserve">- </w:t>
+      </w:r>
+      <w:r>
+        <w:rPr>
+          <w:rFonts w:ascii="Segoe UI Emoji" w:hAnsi="Segoe UI Emoji" w:cs="Segoe UI Emoji"/>
+        </w:rPr>
+        <w:t>⚠️</w:t>
+      </w:r>
+      <w:r>
+        <w:t xml:space="preserve"> Multiple data feed integrations pending</w:t>
+      </w:r>
+    </w:p>
+    <w:p>
+      <w:pPr>
+        <w:spacing w:line="240" w:lineRule="auto"/>
+      </w:pPr>
+    </w:p>
+    <w:p>
+      <w:pPr>
+        <w:spacing w:line="240" w:lineRule="auto"/>
+      </w:pPr>
+      <w:r>
+        <w:t>## Overall Assessment</w:t>
+      </w:r>
+    </w:p>
+    <w:p>
+      <w:pPr>
+        <w:spacing w:line="240" w:lineRule="auto"/>
+      </w:pPr>
+    </w:p>
+    <w:p>
+      <w:pPr>
+        <w:spacing w:line="240" w:lineRule="auto"/>
+      </w:pPr>
+      <w:r>
+        <w:t>The algorithmic trading system has achieved approximately **78% completion** across all three phases, with a solid foundation ready for production use but requiring attention to placeholder implementations and incomplete features before full deployment.</w:t>
+      </w:r>
+    </w:p>
+    <w:p>
+      <w:pPr>
+        <w:spacing w:line="240" w:lineRule="auto"/>
+      </w:pPr>
+    </w:p>
+    <w:p>
+      <w:pPr>
+        <w:spacing w:line="240" w:lineRule="auto"/>
+      </w:pPr>
+      <w:r>
+        <w:t>The detailed audit report provides stakeholders with a clear, evidence-based assessment of the project's true completion status.</w:t>
+      </w:r>
     </w:p>
     <w:p>
       <w:pPr>
@@ -17879,6 +20673,155 @@
     </w:lvl>
   </w:abstractNum>
   <w:abstractNum w:abstractNumId="5" w15:restartNumberingAfterBreak="0">
+    <w:nsid w:val="1BF007B7"/>
+    <w:multiLevelType w:val="multilevel"/>
+    <w:tmpl w:val="49885EC2"/>
+    <w:lvl w:ilvl="0">
+      <w:start w:val="1"/>
+      <w:numFmt w:val="bullet"/>
+      <w:lvlText w:val=""/>
+      <w:lvlJc w:val="left"/>
+      <w:pPr>
+        <w:tabs>
+          <w:tab w:val="num" w:pos="720"/>
+        </w:tabs>
+        <w:ind w:left="720" w:hanging="360"/>
+      </w:pPr>
+      <w:rPr>
+        <w:rFonts w:ascii="Symbol" w:hAnsi="Symbol" w:hint="default"/>
+        <w:sz w:val="20"/>
+      </w:rPr>
+    </w:lvl>
+    <w:lvl w:ilvl="1" w:tentative="1">
+      <w:start w:val="1"/>
+      <w:numFmt w:val="bullet"/>
+      <w:lvlText w:val="o"/>
+      <w:lvlJc w:val="left"/>
+      <w:pPr>
+        <w:tabs>
+          <w:tab w:val="num" w:pos="1440"/>
+        </w:tabs>
+        <w:ind w:left="1440" w:hanging="360"/>
+      </w:pPr>
+      <w:rPr>
+        <w:rFonts w:ascii="Courier New" w:hAnsi="Courier New" w:hint="default"/>
+        <w:sz w:val="20"/>
+      </w:rPr>
+    </w:lvl>
+    <w:lvl w:ilvl="2" w:tentative="1">
+      <w:start w:val="1"/>
+      <w:numFmt w:val="bullet"/>
+      <w:lvlText w:val=""/>
+      <w:lvlJc w:val="left"/>
+      <w:pPr>
+        <w:tabs>
+          <w:tab w:val="num" w:pos="2160"/>
+        </w:tabs>
+        <w:ind w:left="2160" w:hanging="360"/>
+      </w:pPr>
+      <w:rPr>
+        <w:rFonts w:ascii="Wingdings" w:hAnsi="Wingdings" w:hint="default"/>
+        <w:sz w:val="20"/>
+      </w:rPr>
+    </w:lvl>
+    <w:lvl w:ilvl="3" w:tentative="1">
+      <w:start w:val="1"/>
+      <w:numFmt w:val="bullet"/>
+      <w:lvlText w:val=""/>
+      <w:lvlJc w:val="left"/>
+      <w:pPr>
+        <w:tabs>
+          <w:tab w:val="num" w:pos="2880"/>
+        </w:tabs>
+        <w:ind w:left="2880" w:hanging="360"/>
+      </w:pPr>
+      <w:rPr>
+        <w:rFonts w:ascii="Wingdings" w:hAnsi="Wingdings" w:hint="default"/>
+        <w:sz w:val="20"/>
+      </w:rPr>
+    </w:lvl>
+    <w:lvl w:ilvl="4" w:tentative="1">
+      <w:start w:val="1"/>
+      <w:numFmt w:val="bullet"/>
+      <w:lvlText w:val=""/>
+      <w:lvlJc w:val="left"/>
+      <w:pPr>
+        <w:tabs>
+          <w:tab w:val="num" w:pos="3600"/>
+        </w:tabs>
+        <w:ind w:left="3600" w:hanging="360"/>
+      </w:pPr>
+      <w:rPr>
+        <w:rFonts w:ascii="Wingdings" w:hAnsi="Wingdings" w:hint="default"/>
+        <w:sz w:val="20"/>
+      </w:rPr>
+    </w:lvl>
+    <w:lvl w:ilvl="5" w:tentative="1">
+      <w:start w:val="1"/>
+      <w:numFmt w:val="bullet"/>
+      <w:lvlText w:val=""/>
+      <w:lvlJc w:val="left"/>
+      <w:pPr>
+        <w:tabs>
+          <w:tab w:val="num" w:pos="4320"/>
+        </w:tabs>
+        <w:ind w:left="4320" w:hanging="360"/>
+      </w:pPr>
+      <w:rPr>
+        <w:rFonts w:ascii="Wingdings" w:hAnsi="Wingdings" w:hint="default"/>
+        <w:sz w:val="20"/>
+      </w:rPr>
+    </w:lvl>
+    <w:lvl w:ilvl="6" w:tentative="1">
+      <w:start w:val="1"/>
+      <w:numFmt w:val="bullet"/>
+      <w:lvlText w:val=""/>
+      <w:lvlJc w:val="left"/>
+      <w:pPr>
+        <w:tabs>
+          <w:tab w:val="num" w:pos="5040"/>
+        </w:tabs>
+        <w:ind w:left="5040" w:hanging="360"/>
+      </w:pPr>
+      <w:rPr>
+        <w:rFonts w:ascii="Wingdings" w:hAnsi="Wingdings" w:hint="default"/>
+        <w:sz w:val="20"/>
+      </w:rPr>
+    </w:lvl>
+    <w:lvl w:ilvl="7" w:tentative="1">
+      <w:start w:val="1"/>
+      <w:numFmt w:val="bullet"/>
+      <w:lvlText w:val=""/>
+      <w:lvlJc w:val="left"/>
+      <w:pPr>
+        <w:tabs>
+          <w:tab w:val="num" w:pos="5760"/>
+        </w:tabs>
+        <w:ind w:left="5760" w:hanging="360"/>
+      </w:pPr>
+      <w:rPr>
+        <w:rFonts w:ascii="Wingdings" w:hAnsi="Wingdings" w:hint="default"/>
+        <w:sz w:val="20"/>
+      </w:rPr>
+    </w:lvl>
+    <w:lvl w:ilvl="8" w:tentative="1">
+      <w:start w:val="1"/>
+      <w:numFmt w:val="bullet"/>
+      <w:lvlText w:val=""/>
+      <w:lvlJc w:val="left"/>
+      <w:pPr>
+        <w:tabs>
+          <w:tab w:val="num" w:pos="6480"/>
+        </w:tabs>
+        <w:ind w:left="6480" w:hanging="360"/>
+      </w:pPr>
+      <w:rPr>
+        <w:rFonts w:ascii="Wingdings" w:hAnsi="Wingdings" w:hint="default"/>
+        <w:sz w:val="20"/>
+      </w:rPr>
+    </w:lvl>
+  </w:abstractNum>
+  <w:abstractNum w:abstractNumId="6" w15:restartNumberingAfterBreak="0">
     <w:nsid w:val="1F0422B2"/>
     <w:multiLevelType w:val="multilevel"/>
     <w:tmpl w:val="78F494B6"/>
@@ -17991,7 +20934,7 @@
       </w:pPr>
     </w:lvl>
   </w:abstractNum>
-  <w:abstractNum w:abstractNumId="6" w15:restartNumberingAfterBreak="0">
+  <w:abstractNum w:abstractNumId="7" w15:restartNumberingAfterBreak="0">
     <w:nsid w:val="27CC03F5"/>
     <w:multiLevelType w:val="multilevel"/>
     <w:tmpl w:val="E7F095E4"/>
@@ -18140,7 +21083,7 @@
       </w:rPr>
     </w:lvl>
   </w:abstractNum>
-  <w:abstractNum w:abstractNumId="7" w15:restartNumberingAfterBreak="0">
+  <w:abstractNum w:abstractNumId="8" w15:restartNumberingAfterBreak="0">
     <w:nsid w:val="338C4B10"/>
     <w:multiLevelType w:val="multilevel"/>
     <w:tmpl w:val="E02815D0"/>
@@ -18257,7 +21200,7 @@
       </w:pPr>
     </w:lvl>
   </w:abstractNum>
-  <w:abstractNum w:abstractNumId="8" w15:restartNumberingAfterBreak="0">
+  <w:abstractNum w:abstractNumId="9" w15:restartNumberingAfterBreak="0">
     <w:nsid w:val="33C1236A"/>
     <w:multiLevelType w:val="multilevel"/>
     <w:tmpl w:val="A610242E"/>
@@ -18374,7 +21317,7 @@
       </w:pPr>
     </w:lvl>
   </w:abstractNum>
-  <w:abstractNum w:abstractNumId="9" w15:restartNumberingAfterBreak="0">
+  <w:abstractNum w:abstractNumId="10" w15:restartNumberingAfterBreak="0">
     <w:nsid w:val="3538571D"/>
     <w:multiLevelType w:val="multilevel"/>
     <w:tmpl w:val="87BA4CF0"/>
@@ -18495,7 +21438,7 @@
       </w:pPr>
     </w:lvl>
   </w:abstractNum>
-  <w:abstractNum w:abstractNumId="10" w15:restartNumberingAfterBreak="0">
+  <w:abstractNum w:abstractNumId="11" w15:restartNumberingAfterBreak="0">
     <w:nsid w:val="358277DD"/>
     <w:multiLevelType w:val="multilevel"/>
     <w:tmpl w:val="3BE88EC8"/>
@@ -18644,7 +21587,7 @@
       </w:rPr>
     </w:lvl>
   </w:abstractNum>
-  <w:abstractNum w:abstractNumId="11" w15:restartNumberingAfterBreak="0">
+  <w:abstractNum w:abstractNumId="12" w15:restartNumberingAfterBreak="0">
     <w:nsid w:val="35A424B8"/>
     <w:multiLevelType w:val="multilevel"/>
     <w:tmpl w:val="B8620E70"/>
@@ -18793,7 +21736,7 @@
       </w:rPr>
     </w:lvl>
   </w:abstractNum>
-  <w:abstractNum w:abstractNumId="12" w15:restartNumberingAfterBreak="0">
+  <w:abstractNum w:abstractNumId="13" w15:restartNumberingAfterBreak="0">
     <w:nsid w:val="369B03D0"/>
     <w:multiLevelType w:val="multilevel"/>
     <w:tmpl w:val="CC3223CC"/>
@@ -18906,7 +21849,233 @@
       </w:pPr>
     </w:lvl>
   </w:abstractNum>
-  <w:abstractNum w:abstractNumId="13" w15:restartNumberingAfterBreak="0">
+  <w:abstractNum w:abstractNumId="14" w15:restartNumberingAfterBreak="0">
+    <w:nsid w:val="382D561B"/>
+    <w:multiLevelType w:val="multilevel"/>
+    <w:tmpl w:val="2536D206"/>
+    <w:lvl w:ilvl="0">
+      <w:start w:val="1"/>
+      <w:numFmt w:val="decimal"/>
+      <w:lvlText w:val="%1."/>
+      <w:lvlJc w:val="left"/>
+      <w:pPr>
+        <w:tabs>
+          <w:tab w:val="num" w:pos="720"/>
+        </w:tabs>
+        <w:ind w:left="720" w:hanging="360"/>
+      </w:pPr>
+    </w:lvl>
+    <w:lvl w:ilvl="1" w:tentative="1">
+      <w:start w:val="1"/>
+      <w:numFmt w:val="decimal"/>
+      <w:lvlText w:val="%2."/>
+      <w:lvlJc w:val="left"/>
+      <w:pPr>
+        <w:tabs>
+          <w:tab w:val="num" w:pos="1440"/>
+        </w:tabs>
+        <w:ind w:left="1440" w:hanging="360"/>
+      </w:pPr>
+    </w:lvl>
+    <w:lvl w:ilvl="2" w:tentative="1">
+      <w:start w:val="1"/>
+      <w:numFmt w:val="decimal"/>
+      <w:lvlText w:val="%3."/>
+      <w:lvlJc w:val="left"/>
+      <w:pPr>
+        <w:tabs>
+          <w:tab w:val="num" w:pos="2160"/>
+        </w:tabs>
+        <w:ind w:left="2160" w:hanging="360"/>
+      </w:pPr>
+    </w:lvl>
+    <w:lvl w:ilvl="3" w:tentative="1">
+      <w:start w:val="1"/>
+      <w:numFmt w:val="decimal"/>
+      <w:lvlText w:val="%4."/>
+      <w:lvlJc w:val="left"/>
+      <w:pPr>
+        <w:tabs>
+          <w:tab w:val="num" w:pos="2880"/>
+        </w:tabs>
+        <w:ind w:left="2880" w:hanging="360"/>
+      </w:pPr>
+    </w:lvl>
+    <w:lvl w:ilvl="4" w:tentative="1">
+      <w:start w:val="1"/>
+      <w:numFmt w:val="decimal"/>
+      <w:lvlText w:val="%5."/>
+      <w:lvlJc w:val="left"/>
+      <w:pPr>
+        <w:tabs>
+          <w:tab w:val="num" w:pos="3600"/>
+        </w:tabs>
+        <w:ind w:left="3600" w:hanging="360"/>
+      </w:pPr>
+    </w:lvl>
+    <w:lvl w:ilvl="5" w:tentative="1">
+      <w:start w:val="1"/>
+      <w:numFmt w:val="decimal"/>
+      <w:lvlText w:val="%6."/>
+      <w:lvlJc w:val="left"/>
+      <w:pPr>
+        <w:tabs>
+          <w:tab w:val="num" w:pos="4320"/>
+        </w:tabs>
+        <w:ind w:left="4320" w:hanging="360"/>
+      </w:pPr>
+    </w:lvl>
+    <w:lvl w:ilvl="6" w:tentative="1">
+      <w:start w:val="1"/>
+      <w:numFmt w:val="decimal"/>
+      <w:lvlText w:val="%7."/>
+      <w:lvlJc w:val="left"/>
+      <w:pPr>
+        <w:tabs>
+          <w:tab w:val="num" w:pos="5040"/>
+        </w:tabs>
+        <w:ind w:left="5040" w:hanging="360"/>
+      </w:pPr>
+    </w:lvl>
+    <w:lvl w:ilvl="7" w:tentative="1">
+      <w:start w:val="1"/>
+      <w:numFmt w:val="decimal"/>
+      <w:lvlText w:val="%8."/>
+      <w:lvlJc w:val="left"/>
+      <w:pPr>
+        <w:tabs>
+          <w:tab w:val="num" w:pos="5760"/>
+        </w:tabs>
+        <w:ind w:left="5760" w:hanging="360"/>
+      </w:pPr>
+    </w:lvl>
+    <w:lvl w:ilvl="8" w:tentative="1">
+      <w:start w:val="1"/>
+      <w:numFmt w:val="decimal"/>
+      <w:lvlText w:val="%9."/>
+      <w:lvlJc w:val="left"/>
+      <w:pPr>
+        <w:tabs>
+          <w:tab w:val="num" w:pos="6480"/>
+        </w:tabs>
+        <w:ind w:left="6480" w:hanging="360"/>
+      </w:pPr>
+    </w:lvl>
+  </w:abstractNum>
+  <w:abstractNum w:abstractNumId="15" w15:restartNumberingAfterBreak="0">
+    <w:nsid w:val="3A06396B"/>
+    <w:multiLevelType w:val="multilevel"/>
+    <w:tmpl w:val="E620148E"/>
+    <w:lvl w:ilvl="0">
+      <w:start w:val="1"/>
+      <w:numFmt w:val="decimal"/>
+      <w:lvlText w:val="%1."/>
+      <w:lvlJc w:val="left"/>
+      <w:pPr>
+        <w:tabs>
+          <w:tab w:val="num" w:pos="720"/>
+        </w:tabs>
+        <w:ind w:left="720" w:hanging="360"/>
+      </w:pPr>
+    </w:lvl>
+    <w:lvl w:ilvl="1" w:tentative="1">
+      <w:start w:val="1"/>
+      <w:numFmt w:val="decimal"/>
+      <w:lvlText w:val="%2."/>
+      <w:lvlJc w:val="left"/>
+      <w:pPr>
+        <w:tabs>
+          <w:tab w:val="num" w:pos="1440"/>
+        </w:tabs>
+        <w:ind w:left="1440" w:hanging="360"/>
+      </w:pPr>
+    </w:lvl>
+    <w:lvl w:ilvl="2" w:tentative="1">
+      <w:start w:val="1"/>
+      <w:numFmt w:val="decimal"/>
+      <w:lvlText w:val="%3."/>
+      <w:lvlJc w:val="left"/>
+      <w:pPr>
+        <w:tabs>
+          <w:tab w:val="num" w:pos="2160"/>
+        </w:tabs>
+        <w:ind w:left="2160" w:hanging="360"/>
+      </w:pPr>
+    </w:lvl>
+    <w:lvl w:ilvl="3" w:tentative="1">
+      <w:start w:val="1"/>
+      <w:numFmt w:val="decimal"/>
+      <w:lvlText w:val="%4."/>
+      <w:lvlJc w:val="left"/>
+      <w:pPr>
+        <w:tabs>
+          <w:tab w:val="num" w:pos="2880"/>
+        </w:tabs>
+        <w:ind w:left="2880" w:hanging="360"/>
+      </w:pPr>
+    </w:lvl>
+    <w:lvl w:ilvl="4" w:tentative="1">
+      <w:start w:val="1"/>
+      <w:numFmt w:val="decimal"/>
+      <w:lvlText w:val="%5."/>
+      <w:lvlJc w:val="left"/>
+      <w:pPr>
+        <w:tabs>
+          <w:tab w:val="num" w:pos="3600"/>
+        </w:tabs>
+        <w:ind w:left="3600" w:hanging="360"/>
+      </w:pPr>
+    </w:lvl>
+    <w:lvl w:ilvl="5" w:tentative="1">
+      <w:start w:val="1"/>
+      <w:numFmt w:val="decimal"/>
+      <w:lvlText w:val="%6."/>
+      <w:lvlJc w:val="left"/>
+      <w:pPr>
+        <w:tabs>
+          <w:tab w:val="num" w:pos="4320"/>
+        </w:tabs>
+        <w:ind w:left="4320" w:hanging="360"/>
+      </w:pPr>
+    </w:lvl>
+    <w:lvl w:ilvl="6" w:tentative="1">
+      <w:start w:val="1"/>
+      <w:numFmt w:val="decimal"/>
+      <w:lvlText w:val="%7."/>
+      <w:lvlJc w:val="left"/>
+      <w:pPr>
+        <w:tabs>
+          <w:tab w:val="num" w:pos="5040"/>
+        </w:tabs>
+        <w:ind w:left="5040" w:hanging="360"/>
+      </w:pPr>
+    </w:lvl>
+    <w:lvl w:ilvl="7" w:tentative="1">
+      <w:start w:val="1"/>
+      <w:numFmt w:val="decimal"/>
+      <w:lvlText w:val="%8."/>
+      <w:lvlJc w:val="left"/>
+      <w:pPr>
+        <w:tabs>
+          <w:tab w:val="num" w:pos="5760"/>
+        </w:tabs>
+        <w:ind w:left="5760" w:hanging="360"/>
+      </w:pPr>
+    </w:lvl>
+    <w:lvl w:ilvl="8" w:tentative="1">
+      <w:start w:val="1"/>
+      <w:numFmt w:val="decimal"/>
+      <w:lvlText w:val="%9."/>
+      <w:lvlJc w:val="left"/>
+      <w:pPr>
+        <w:tabs>
+          <w:tab w:val="num" w:pos="6480"/>
+        </w:tabs>
+        <w:ind w:left="6480" w:hanging="360"/>
+      </w:pPr>
+    </w:lvl>
+  </w:abstractNum>
+  <w:abstractNum w:abstractNumId="16" w15:restartNumberingAfterBreak="0">
     <w:nsid w:val="3D6F052F"/>
     <w:multiLevelType w:val="multilevel"/>
     <w:tmpl w:val="21A40C3C"/>
@@ -19055,7 +22224,7 @@
       </w:rPr>
     </w:lvl>
   </w:abstractNum>
-  <w:abstractNum w:abstractNumId="14" w15:restartNumberingAfterBreak="0">
+  <w:abstractNum w:abstractNumId="17" w15:restartNumberingAfterBreak="0">
     <w:nsid w:val="3D9B3139"/>
     <w:multiLevelType w:val="hybridMultilevel"/>
     <w:tmpl w:val="1C2ABC94"/>
@@ -19144,7 +22313,7 @@
       </w:pPr>
     </w:lvl>
   </w:abstractNum>
-  <w:abstractNum w:abstractNumId="15" w15:restartNumberingAfterBreak="0">
+  <w:abstractNum w:abstractNumId="18" w15:restartNumberingAfterBreak="0">
     <w:nsid w:val="3F3F0F5C"/>
     <w:multiLevelType w:val="multilevel"/>
     <w:tmpl w:val="D7764D6E"/>
@@ -19261,7 +22430,7 @@
       </w:pPr>
     </w:lvl>
   </w:abstractNum>
-  <w:abstractNum w:abstractNumId="16" w15:restartNumberingAfterBreak="0">
+  <w:abstractNum w:abstractNumId="19" w15:restartNumberingAfterBreak="0">
     <w:nsid w:val="500F1577"/>
     <w:multiLevelType w:val="multilevel"/>
     <w:tmpl w:val="54942292"/>
@@ -19410,7 +22579,7 @@
       </w:rPr>
     </w:lvl>
   </w:abstractNum>
-  <w:abstractNum w:abstractNumId="17" w15:restartNumberingAfterBreak="0">
+  <w:abstractNum w:abstractNumId="20" w15:restartNumberingAfterBreak="0">
     <w:nsid w:val="52997CED"/>
     <w:multiLevelType w:val="multilevel"/>
     <w:tmpl w:val="E65C1EF4"/>
@@ -19559,7 +22728,7 @@
       </w:rPr>
     </w:lvl>
   </w:abstractNum>
-  <w:abstractNum w:abstractNumId="18" w15:restartNumberingAfterBreak="0">
+  <w:abstractNum w:abstractNumId="21" w15:restartNumberingAfterBreak="0">
     <w:nsid w:val="553C1816"/>
     <w:multiLevelType w:val="multilevel"/>
     <w:tmpl w:val="1166FDD8"/>
@@ -19680,7 +22849,7 @@
       </w:pPr>
     </w:lvl>
   </w:abstractNum>
-  <w:abstractNum w:abstractNumId="19" w15:restartNumberingAfterBreak="0">
+  <w:abstractNum w:abstractNumId="22" w15:restartNumberingAfterBreak="0">
     <w:nsid w:val="56F65874"/>
     <w:multiLevelType w:val="hybridMultilevel"/>
     <w:tmpl w:val="2200C128"/>
@@ -19793,7 +22962,7 @@
       </w:rPr>
     </w:lvl>
   </w:abstractNum>
-  <w:abstractNum w:abstractNumId="20" w15:restartNumberingAfterBreak="0">
+  <w:abstractNum w:abstractNumId="23" w15:restartNumberingAfterBreak="0">
     <w:nsid w:val="5E900391"/>
     <w:multiLevelType w:val="multilevel"/>
     <w:tmpl w:val="F69678D4"/>
@@ -19910,7 +23079,7 @@
       </w:pPr>
     </w:lvl>
   </w:abstractNum>
-  <w:abstractNum w:abstractNumId="21" w15:restartNumberingAfterBreak="0">
+  <w:abstractNum w:abstractNumId="24" w15:restartNumberingAfterBreak="0">
     <w:nsid w:val="631E446E"/>
     <w:multiLevelType w:val="multilevel"/>
     <w:tmpl w:val="09A45166"/>
@@ -20059,7 +23228,7 @@
       </w:rPr>
     </w:lvl>
   </w:abstractNum>
-  <w:abstractNum w:abstractNumId="22" w15:restartNumberingAfterBreak="0">
+  <w:abstractNum w:abstractNumId="25" w15:restartNumberingAfterBreak="0">
     <w:nsid w:val="6B7A7452"/>
     <w:multiLevelType w:val="multilevel"/>
     <w:tmpl w:val="CC1E435E"/>
@@ -20180,7 +23349,7 @@
       </w:pPr>
     </w:lvl>
   </w:abstractNum>
-  <w:abstractNum w:abstractNumId="23" w15:restartNumberingAfterBreak="0">
+  <w:abstractNum w:abstractNumId="26" w15:restartNumberingAfterBreak="0">
     <w:nsid w:val="6FCF2B10"/>
     <w:multiLevelType w:val="multilevel"/>
     <w:tmpl w:val="67327208"/>
@@ -20293,7 +23462,7 @@
       </w:pPr>
     </w:lvl>
   </w:abstractNum>
-  <w:abstractNum w:abstractNumId="24" w15:restartNumberingAfterBreak="0">
+  <w:abstractNum w:abstractNumId="27" w15:restartNumberingAfterBreak="0">
     <w:nsid w:val="747C0F6D"/>
     <w:multiLevelType w:val="multilevel"/>
     <w:tmpl w:val="E09C56D4"/>
@@ -20442,7 +23611,7 @@
       </w:rPr>
     </w:lvl>
   </w:abstractNum>
-  <w:abstractNum w:abstractNumId="25" w15:restartNumberingAfterBreak="0">
+  <w:abstractNum w:abstractNumId="28" w15:restartNumberingAfterBreak="0">
     <w:nsid w:val="74DF6FF7"/>
     <w:multiLevelType w:val="hybridMultilevel"/>
     <w:tmpl w:val="9B0821F8"/>
@@ -20531,7 +23700,7 @@
       </w:pPr>
     </w:lvl>
   </w:abstractNum>
-  <w:abstractNum w:abstractNumId="26" w15:restartNumberingAfterBreak="0">
+  <w:abstractNum w:abstractNumId="29" w15:restartNumberingAfterBreak="0">
     <w:nsid w:val="7A8F25FA"/>
     <w:multiLevelType w:val="hybridMultilevel"/>
     <w:tmpl w:val="49861964"/>
@@ -20644,7 +23813,7 @@
       </w:rPr>
     </w:lvl>
   </w:abstractNum>
-  <w:abstractNum w:abstractNumId="27" w15:restartNumberingAfterBreak="0">
+  <w:abstractNum w:abstractNumId="30" w15:restartNumberingAfterBreak="0">
     <w:nsid w:val="7ACD6A16"/>
     <w:multiLevelType w:val="multilevel"/>
     <w:tmpl w:val="C2A60E76"/>
@@ -20761,7 +23930,120 @@
       </w:pPr>
     </w:lvl>
   </w:abstractNum>
-  <w:abstractNum w:abstractNumId="28" w15:restartNumberingAfterBreak="0">
+  <w:abstractNum w:abstractNumId="31" w15:restartNumberingAfterBreak="0">
+    <w:nsid w:val="7E3A3CAE"/>
+    <w:multiLevelType w:val="multilevel"/>
+    <w:tmpl w:val="3C4A41A0"/>
+    <w:lvl w:ilvl="0">
+      <w:start w:val="1"/>
+      <w:numFmt w:val="decimal"/>
+      <w:lvlText w:val="%1."/>
+      <w:lvlJc w:val="left"/>
+      <w:pPr>
+        <w:tabs>
+          <w:tab w:val="num" w:pos="720"/>
+        </w:tabs>
+        <w:ind w:left="720" w:hanging="360"/>
+      </w:pPr>
+    </w:lvl>
+    <w:lvl w:ilvl="1" w:tentative="1">
+      <w:start w:val="1"/>
+      <w:numFmt w:val="decimal"/>
+      <w:lvlText w:val="%2."/>
+      <w:lvlJc w:val="left"/>
+      <w:pPr>
+        <w:tabs>
+          <w:tab w:val="num" w:pos="1440"/>
+        </w:tabs>
+        <w:ind w:left="1440" w:hanging="360"/>
+      </w:pPr>
+    </w:lvl>
+    <w:lvl w:ilvl="2" w:tentative="1">
+      <w:start w:val="1"/>
+      <w:numFmt w:val="decimal"/>
+      <w:lvlText w:val="%3."/>
+      <w:lvlJc w:val="left"/>
+      <w:pPr>
+        <w:tabs>
+          <w:tab w:val="num" w:pos="2160"/>
+        </w:tabs>
+        <w:ind w:left="2160" w:hanging="360"/>
+      </w:pPr>
+    </w:lvl>
+    <w:lvl w:ilvl="3" w:tentative="1">
+      <w:start w:val="1"/>
+      <w:numFmt w:val="decimal"/>
+      <w:lvlText w:val="%4."/>
+      <w:lvlJc w:val="left"/>
+      <w:pPr>
+        <w:tabs>
+          <w:tab w:val="num" w:pos="2880"/>
+        </w:tabs>
+        <w:ind w:left="2880" w:hanging="360"/>
+      </w:pPr>
+    </w:lvl>
+    <w:lvl w:ilvl="4" w:tentative="1">
+      <w:start w:val="1"/>
+      <w:numFmt w:val="decimal"/>
+      <w:lvlText w:val="%5."/>
+      <w:lvlJc w:val="left"/>
+      <w:pPr>
+        <w:tabs>
+          <w:tab w:val="num" w:pos="3600"/>
+        </w:tabs>
+        <w:ind w:left="3600" w:hanging="360"/>
+      </w:pPr>
+    </w:lvl>
+    <w:lvl w:ilvl="5" w:tentative="1">
+      <w:start w:val="1"/>
+      <w:numFmt w:val="decimal"/>
+      <w:lvlText w:val="%6."/>
+      <w:lvlJc w:val="left"/>
+      <w:pPr>
+        <w:tabs>
+          <w:tab w:val="num" w:pos="4320"/>
+        </w:tabs>
+        <w:ind w:left="4320" w:hanging="360"/>
+      </w:pPr>
+    </w:lvl>
+    <w:lvl w:ilvl="6" w:tentative="1">
+      <w:start w:val="1"/>
+      <w:numFmt w:val="decimal"/>
+      <w:lvlText w:val="%7."/>
+      <w:lvlJc w:val="left"/>
+      <w:pPr>
+        <w:tabs>
+          <w:tab w:val="num" w:pos="5040"/>
+        </w:tabs>
+        <w:ind w:left="5040" w:hanging="360"/>
+      </w:pPr>
+    </w:lvl>
+    <w:lvl w:ilvl="7" w:tentative="1">
+      <w:start w:val="1"/>
+      <w:numFmt w:val="decimal"/>
+      <w:lvlText w:val="%8."/>
+      <w:lvlJc w:val="left"/>
+      <w:pPr>
+        <w:tabs>
+          <w:tab w:val="num" w:pos="5760"/>
+        </w:tabs>
+        <w:ind w:left="5760" w:hanging="360"/>
+      </w:pPr>
+    </w:lvl>
+    <w:lvl w:ilvl="8" w:tentative="1">
+      <w:start w:val="1"/>
+      <w:numFmt w:val="decimal"/>
+      <w:lvlText w:val="%9."/>
+      <w:lvlJc w:val="left"/>
+      <w:pPr>
+        <w:tabs>
+          <w:tab w:val="num" w:pos="6480"/>
+        </w:tabs>
+        <w:ind w:left="6480" w:hanging="360"/>
+      </w:pPr>
+    </w:lvl>
+  </w:abstractNum>
+  <w:abstractNum w:abstractNumId="32" w15:restartNumberingAfterBreak="0">
     <w:nsid w:val="7EA004AE"/>
     <w:multiLevelType w:val="multilevel"/>
     <w:tmpl w:val="9384CF5E"/>
@@ -20911,7 +24193,7 @@
     </w:lvl>
   </w:abstractNum>
   <w:num w:numId="1" w16cid:durableId="1332172948">
-    <w:abstractNumId w:val="16"/>
+    <w:abstractNumId w:val="19"/>
   </w:num>
   <w:num w:numId="2" w16cid:durableId="1648195509">
     <w:abstractNumId w:val="4"/>
@@ -20920,82 +24202,94 @@
     <w:abstractNumId w:val="3"/>
   </w:num>
   <w:num w:numId="4" w16cid:durableId="2106342881">
+    <w:abstractNumId w:val="26"/>
+  </w:num>
+  <w:num w:numId="5" w16cid:durableId="275913088">
+    <w:abstractNumId w:val="10"/>
+  </w:num>
+  <w:num w:numId="6" w16cid:durableId="143932307">
+    <w:abstractNumId w:val="24"/>
+  </w:num>
+  <w:num w:numId="7" w16cid:durableId="2064255360">
+    <w:abstractNumId w:val="11"/>
+  </w:num>
+  <w:num w:numId="8" w16cid:durableId="1641036444">
+    <w:abstractNumId w:val="7"/>
+  </w:num>
+  <w:num w:numId="9" w16cid:durableId="1819034149">
+    <w:abstractNumId w:val="16"/>
+  </w:num>
+  <w:num w:numId="10" w16cid:durableId="268508394">
+    <w:abstractNumId w:val="12"/>
+  </w:num>
+  <w:num w:numId="11" w16cid:durableId="1949317085">
     <w:abstractNumId w:val="23"/>
   </w:num>
-  <w:num w:numId="5" w16cid:durableId="275913088">
-    <w:abstractNumId w:val="9"/>
+  <w:num w:numId="12" w16cid:durableId="502860847">
+    <w:abstractNumId w:val="8"/>
   </w:num>
-  <w:num w:numId="6" w16cid:durableId="143932307">
+  <w:num w:numId="13" w16cid:durableId="302738871">
+    <w:abstractNumId w:val="25"/>
+  </w:num>
+  <w:num w:numId="14" w16cid:durableId="1614482527">
+    <w:abstractNumId w:val="18"/>
+  </w:num>
+  <w:num w:numId="15" w16cid:durableId="1891960749">
     <w:abstractNumId w:val="21"/>
   </w:num>
-  <w:num w:numId="7" w16cid:durableId="2064255360">
-    <w:abstractNumId w:val="10"/>
-  </w:num>
-  <w:num w:numId="8" w16cid:durableId="1641036444">
-    <w:abstractNumId w:val="6"/>
-  </w:num>
-  <w:num w:numId="9" w16cid:durableId="1819034149">
-    <w:abstractNumId w:val="13"/>
-  </w:num>
-  <w:num w:numId="10" w16cid:durableId="268508394">
-    <w:abstractNumId w:val="11"/>
-  </w:num>
-  <w:num w:numId="11" w16cid:durableId="1949317085">
-    <w:abstractNumId w:val="20"/>
-  </w:num>
-  <w:num w:numId="12" w16cid:durableId="502860847">
-    <w:abstractNumId w:val="7"/>
-  </w:num>
-  <w:num w:numId="13" w16cid:durableId="302738871">
-    <w:abstractNumId w:val="22"/>
-  </w:num>
-  <w:num w:numId="14" w16cid:durableId="1614482527">
-    <w:abstractNumId w:val="15"/>
-  </w:num>
-  <w:num w:numId="15" w16cid:durableId="1891960749">
-    <w:abstractNumId w:val="18"/>
-  </w:num>
   <w:num w:numId="16" w16cid:durableId="1134103454">
-    <w:abstractNumId w:val="8"/>
+    <w:abstractNumId w:val="9"/>
   </w:num>
   <w:num w:numId="17" w16cid:durableId="423304592">
     <w:abstractNumId w:val="1"/>
   </w:num>
   <w:num w:numId="18" w16cid:durableId="400446972">
-    <w:abstractNumId w:val="27"/>
+    <w:abstractNumId w:val="30"/>
   </w:num>
   <w:num w:numId="19" w16cid:durableId="1228882965">
     <w:abstractNumId w:val="2"/>
   </w:num>
   <w:num w:numId="20" w16cid:durableId="947086187">
-    <w:abstractNumId w:val="24"/>
+    <w:abstractNumId w:val="27"/>
   </w:num>
   <w:num w:numId="21" w16cid:durableId="1989356898">
-    <w:abstractNumId w:val="28"/>
+    <w:abstractNumId w:val="32"/>
   </w:num>
   <w:num w:numId="22" w16cid:durableId="1818496784">
-    <w:abstractNumId w:val="26"/>
+    <w:abstractNumId w:val="29"/>
   </w:num>
   <w:num w:numId="23" w16cid:durableId="94982150">
     <w:abstractNumId w:val="0"/>
   </w:num>
   <w:num w:numId="24" w16cid:durableId="1056782481">
-    <w:abstractNumId w:val="19"/>
+    <w:abstractNumId w:val="22"/>
   </w:num>
   <w:num w:numId="25" w16cid:durableId="349918247">
-    <w:abstractNumId w:val="25"/>
+    <w:abstractNumId w:val="28"/>
   </w:num>
   <w:num w:numId="26" w16cid:durableId="1225993354">
-    <w:abstractNumId w:val="12"/>
+    <w:abstractNumId w:val="13"/>
   </w:num>
   <w:num w:numId="27" w16cid:durableId="1410543744">
-    <w:abstractNumId w:val="5"/>
+    <w:abstractNumId w:val="6"/>
   </w:num>
   <w:num w:numId="28" w16cid:durableId="2084863569">
+    <w:abstractNumId w:val="20"/>
+  </w:num>
+  <w:num w:numId="29" w16cid:durableId="869415083">
     <w:abstractNumId w:val="17"/>
   </w:num>
-  <w:num w:numId="29" w16cid:durableId="869415083">
+  <w:num w:numId="30" w16cid:durableId="2014722923">
+    <w:abstractNumId w:val="31"/>
+  </w:num>
+  <w:num w:numId="31" w16cid:durableId="129908804">
+    <w:abstractNumId w:val="15"/>
+  </w:num>
+  <w:num w:numId="32" w16cid:durableId="1531994238">
     <w:abstractNumId w:val="14"/>
+  </w:num>
+  <w:num w:numId="33" w16cid:durableId="1201941490">
+    <w:abstractNumId w:val="5"/>
   </w:num>
 </w:numbering>
 </file>
@@ -21401,7 +24695,7 @@
   <w:style w:type="paragraph" w:default="1" w:styleId="Normal">
     <w:name w:val="Normal"/>
     <w:qFormat/>
-    <w:rsid w:val="00CC327F"/>
+    <w:rsid w:val="00F30803"/>
   </w:style>
   <w:style w:type="paragraph" w:styleId="Heading1">
     <w:name w:val="heading 1"/>
@@ -22331,4 +25625,16 @@
     </a:ext>
   </a:extLst>
 </a:theme>
+</file>
+
+<file path=customXml/item1.xml><?xml version="1.0" encoding="utf-8"?>
+<b:Sources xmlns:b="http://schemas.openxmlformats.org/officeDocument/2006/bibliography" xmlns="http://schemas.openxmlformats.org/officeDocument/2006/bibliography" SelectedStyle="\APASixthEditionOfficeOnline.xsl" StyleName="APA" Version="6"/>
+</file>
+
+<file path=customXml/itemProps1.xml><?xml version="1.0" encoding="utf-8"?>
+<ds:datastoreItem xmlns:ds="http://schemas.openxmlformats.org/officeDocument/2006/customXml" ds:itemID="{3FCDC05C-C52B-4765-8F73-F1746F62F374}">
+  <ds:schemaRefs>
+    <ds:schemaRef ds:uri="http://schemas.openxmlformats.org/officeDocument/2006/bibliography"/>
+  </ds:schemaRefs>
+</ds:datastoreItem>
 </file>
</xml_diff>